<commit_message>
profiling status, reasons, location and ratings
</commit_message>
<xml_diff>
--- a/profiling.docx
+++ b/profiling.docx
@@ -9,12 +9,14 @@
           <w:ilvl w:val="0"/>
           <w:numId w:val="3"/>
         </w:numPr>
-      </w:pPr>
-      <w:r>
-        <w:t xml:space="preserve">Date, Time, </w:t>
-      </w:r>
-    </w:p>
-    <w:p>
+        <w:rPr/>
+      </w:pPr>
+      <w:r>
+        <w:rPr/>
+        <w:t>Date, Time</w:t>
+      </w:r>
+    </w:p>
+    <w:p xmlns:wp14="http://schemas.microsoft.com/office/word/2010/wordml" wp14:textId="77777777">
       <w:pPr>
         <w:pStyle w:val="ListParagraph"/>
         <w:numPr>
@@ -82,7 +84,7 @@
         <w:t xml:space="preserve"> 31/12/2024</w:t>
       </w:r>
     </w:p>
-    <w:p>
+    <w:p xmlns:wp14="http://schemas.microsoft.com/office/word/2010/wordml" wp14:textId="77777777">
       <w:pPr>
         <w:pStyle w:val="ListParagraph"/>
         <w:numPr>
@@ -110,7 +112,7 @@
         <w:t xml:space="preserve"> 24h</w:t>
       </w:r>
     </w:p>
-    <w:p>
+    <w:p xmlns:wp14="http://schemas.microsoft.com/office/word/2010/wordml" wp14:textId="77777777">
       <w:pPr>
         <w:pStyle w:val="ListParagraph"/>
         <w:numPr>
@@ -183,7 +185,7 @@
         <w:t>):</w:t>
       </w:r>
     </w:p>
-    <w:p>
+    <w:p xmlns:wp14="http://schemas.microsoft.com/office/word/2010/wordml" wp14:textId="77777777">
       <w:pPr>
         <w:pStyle w:val="ListParagraph"/>
         <w:numPr>
@@ -235,7 +237,7 @@
         <w:t xml:space="preserve"> No Driver Found)</w:t>
       </w:r>
     </w:p>
-    <w:p>
+    <w:p xmlns:wp14="http://schemas.microsoft.com/office/word/2010/wordml" wp14:textId="77777777">
       <w:pPr>
         <w:pStyle w:val="ListParagraph"/>
         <w:numPr>
@@ -255,7 +257,7 @@
         <w:t>)</w:t>
       </w:r>
     </w:p>
-    <w:p>
+    <w:p xmlns:wp14="http://schemas.microsoft.com/office/word/2010/wordml" wp14:textId="77777777">
       <w:pPr>
         <w:pStyle w:val="ListParagraph"/>
         <w:numPr>
@@ -275,7 +277,7 @@
         <w:t>)</w:t>
       </w:r>
     </w:p>
-    <w:p>
+    <w:p xmlns:wp14="http://schemas.microsoft.com/office/word/2010/wordml" wp14:textId="77777777">
       <w:pPr>
         <w:pStyle w:val="ListParagraph"/>
         <w:numPr>
@@ -300,7 +302,7 @@
         <w:t>)</w:t>
       </w:r>
     </w:p>
-    <w:p>
+    <w:p xmlns:wp14="http://schemas.microsoft.com/office/word/2010/wordml" wp14:textId="77777777">
       <w:pPr>
         <w:pStyle w:val="ListParagraph"/>
         <w:numPr>
@@ -389,7 +391,7 @@
         <w:t>)</w:t>
       </w:r>
     </w:p>
-    <w:p>
+    <w:p xmlns:wp14="http://schemas.microsoft.com/office/word/2010/wordml" wp14:textId="77777777">
       <w:pPr>
         <w:pStyle w:val="ListParagraph"/>
         <w:numPr>
@@ -449,7 +451,7 @@
         <w:t xml:space="preserve"> Incomplete)</w:t>
       </w:r>
     </w:p>
-    <w:p>
+    <w:p xmlns:wp14="http://schemas.microsoft.com/office/word/2010/wordml" wp14:textId="77777777">
       <w:pPr>
         <w:pStyle w:val="ListParagraph"/>
         <w:numPr>
@@ -466,7 +468,7 @@
       </w:r>
       <w:proofErr w:type="spellEnd"/>
     </w:p>
-    <w:p>
+    <w:p xmlns:wp14="http://schemas.microsoft.com/office/word/2010/wordml" wp14:textId="77777777">
       <w:pPr>
         <w:pStyle w:val="ListParagraph"/>
         <w:numPr>
@@ -483,7 +485,7 @@
       </w:r>
       <w:proofErr w:type="spellEnd"/>
     </w:p>
-    <w:p>
+    <w:p xmlns:wp14="http://schemas.microsoft.com/office/word/2010/wordml" wp14:textId="77777777">
       <w:pPr>
         <w:pStyle w:val="ListParagraph"/>
         <w:numPr>
@@ -505,7 +507,7 @@
       </w:r>
       <w:proofErr w:type="spellEnd"/>
     </w:p>
-    <w:p>
+    <w:p xmlns:wp14="http://schemas.microsoft.com/office/word/2010/wordml" wp14:textId="77777777">
       <w:pPr>
         <w:pStyle w:val="ListParagraph"/>
         <w:numPr>
@@ -536,7 +538,7 @@
         <w:t>)</w:t>
       </w:r>
     </w:p>
-    <w:p>
+    <w:p xmlns:wp14="http://schemas.microsoft.com/office/word/2010/wordml" wp14:textId="77777777">
       <w:pPr>
         <w:pStyle w:val="ListParagraph"/>
         <w:numPr>
@@ -752,7 +754,7 @@
         <w:t>)</w:t>
       </w:r>
     </w:p>
-    <w:p>
+    <w:p xmlns:wp14="http://schemas.microsoft.com/office/word/2010/wordml" wp14:textId="77777777">
       <w:pPr>
         <w:pStyle w:val="ListParagraph"/>
         <w:numPr>
@@ -769,7 +771,7 @@
         <w:t xml:space="preserve"> 50</w:t>
       </w:r>
     </w:p>
-    <w:p>
+    <w:p xmlns:wp14="http://schemas.microsoft.com/office/word/2010/wordml" wp14:textId="77777777">
       <w:pPr>
         <w:pStyle w:val="ListParagraph"/>
         <w:numPr>
@@ -786,7 +788,7 @@
         <w:t xml:space="preserve"> 4277</w:t>
       </w:r>
     </w:p>
-    <w:p>
+    <w:p xmlns:wp14="http://schemas.microsoft.com/office/word/2010/wordml" wp14:textId="77777777">
       <w:pPr>
         <w:pStyle w:val="ListParagraph"/>
         <w:numPr>
@@ -808,7 +810,7 @@
         <w:t xml:space="preserve"> 508.3</w:t>
       </w:r>
     </w:p>
-    <w:p>
+    <w:p xmlns:wp14="http://schemas.microsoft.com/office/word/2010/wordml" wp14:textId="77777777">
       <w:pPr>
         <w:pStyle w:val="ListParagraph"/>
         <w:numPr>
@@ -836,7 +838,7 @@
         <w:t>)</w:t>
       </w:r>
     </w:p>
-    <w:p>
+    <w:p xmlns:wp14="http://schemas.microsoft.com/office/word/2010/wordml" wp14:textId="77777777">
       <w:pPr>
         <w:pStyle w:val="ListParagraph"/>
         <w:numPr>
@@ -896,7 +898,7 @@
         <w:t xml:space="preserve"> Booking Value)</w:t>
       </w:r>
     </w:p>
-    <w:p>
+    <w:p xmlns:wp14="http://schemas.microsoft.com/office/word/2010/wordml" wp14:textId="77777777">
       <w:pPr>
         <w:pStyle w:val="ListParagraph"/>
         <w:numPr>
@@ -913,7 +915,7 @@
         <w:t xml:space="preserve"> 1 km</w:t>
       </w:r>
     </w:p>
-    <w:p>
+    <w:p xmlns:wp14="http://schemas.microsoft.com/office/word/2010/wordml" wp14:textId="77777777">
       <w:pPr>
         <w:pStyle w:val="ListParagraph"/>
         <w:numPr>
@@ -930,7 +932,7 @@
         <w:t xml:space="preserve"> 50 km</w:t>
       </w:r>
     </w:p>
-    <w:p>
+    <w:p xmlns:wp14="http://schemas.microsoft.com/office/word/2010/wordml" wp14:textId="77777777">
       <w:pPr>
         <w:pStyle w:val="ListParagraph"/>
         <w:numPr>
@@ -952,7 +954,7 @@
         <w:t xml:space="preserve"> 24.64 km</w:t>
       </w:r>
     </w:p>
-    <w:p>
+    <w:p xmlns:wp14="http://schemas.microsoft.com/office/word/2010/wordml" wp14:textId="77777777">
       <w:pPr>
         <w:pStyle w:val="ListParagraph"/>
         <w:numPr>
@@ -964,7 +966,7 @@
         <w:t>Payment Method</w:t>
       </w:r>
     </w:p>
-    <w:p>
+    <w:p xmlns:wp14="http://schemas.microsoft.com/office/word/2010/wordml" wp14:textId="77777777">
       <w:pPr>
         <w:pStyle w:val="ListParagraph"/>
         <w:numPr>
@@ -1024,7 +1026,7 @@
         <w:t xml:space="preserve"> Booking Value)</w:t>
       </w:r>
     </w:p>
-    <w:p>
+    <w:p xmlns:wp14="http://schemas.microsoft.com/office/word/2010/wordml" wp14:textId="77777777">
       <w:pPr>
         <w:pStyle w:val="ListParagraph"/>
         <w:numPr>
@@ -1041,7 +1043,7 @@
         <w:t xml:space="preserve"> 45909 (~30%)</w:t>
       </w:r>
     </w:p>
-    <w:p>
+    <w:p xmlns:wp14="http://schemas.microsoft.com/office/word/2010/wordml" wp14:textId="77777777">
       <w:pPr>
         <w:pStyle w:val="ListParagraph"/>
         <w:numPr>
@@ -1058,7 +1060,7 @@
         <w:t xml:space="preserve"> 25376 (~16%)</w:t>
       </w:r>
     </w:p>
-    <w:p>
+    <w:p xmlns:wp14="http://schemas.microsoft.com/office/word/2010/wordml" wp14:textId="77777777">
       <w:pPr>
         <w:pStyle w:val="ListParagraph"/>
         <w:numPr>
@@ -1078,7 +1080,7 @@
         <w:t xml:space="preserve"> 12276 (~8%)</w:t>
       </w:r>
     </w:p>
-    <w:p>
+    <w:p xmlns:wp14="http://schemas.microsoft.com/office/word/2010/wordml" wp14:textId="77777777">
       <w:pPr>
         <w:pStyle w:val="ListParagraph"/>
         <w:numPr>
@@ -1098,7 +1100,7 @@
         <w:t xml:space="preserve"> 10209 (~6%)</w:t>
       </w:r>
     </w:p>
-    <w:p>
+    <w:p xmlns:wp14="http://schemas.microsoft.com/office/word/2010/wordml" wp14:textId="77777777">
       <w:pPr>
         <w:pStyle w:val="ListParagraph"/>
         <w:numPr>
@@ -1118,7 +1120,7 @@
         <w:t xml:space="preserve"> 8239 (~5%)</w:t>
       </w:r>
     </w:p>
-    <w:p>
+    <w:p xmlns:wp14="http://schemas.microsoft.com/office/word/2010/wordml" wp14:textId="77777777">
       <w:pPr>
         <w:pStyle w:val="ListParagraph"/>
         <w:numPr>
@@ -1147,29 +1149,2579 @@
           <w:ilvl w:val="1"/>
           <w:numId w:val="2"/>
         </w:numPr>
-      </w:pPr>
-      <w:r>
+        <w:rPr/>
+      </w:pPr>
+      <w:r>
+        <w:rPr/>
         <w:t xml:space="preserve">Auto 37.419, Go Mini 29.806, Go Sedan 27.141, Bike 22.517, Premier Sedan 18.111, </w:t>
       </w:r>
-      <w:proofErr w:type="spellStart"/>
-      <w:r>
+      <w:r>
+        <w:rPr/>
         <w:t>eBike</w:t>
       </w:r>
-      <w:proofErr w:type="spellEnd"/>
-      <w:r>
+      <w:r>
+        <w:rPr/>
         <w:t xml:space="preserve"> 10.557, Uber XL 4.449.</w:t>
       </w:r>
-      <w:bookmarkStart w:id="0" w:name="_GoBack"/>
+      <w:bookmarkStart w:name="_GoBack" w:id="0"/>
       <w:bookmarkEnd w:id="0"/>
     </w:p>
     <w:p>
       <w:pPr>
+        <w:pStyle w:val="ListParagraph"/>
+        <w:numPr>
+          <w:ilvl w:val="0"/>
+          <w:numId w:val="2"/>
+        </w:numPr>
+        <w:rPr/>
+      </w:pPr>
+      <w:r>
+        <w:rPr/>
+        <w:t>Booking Status:</w:t>
+      </w:r>
+    </w:p>
+    <w:p>
+      <w:pPr>
+        <w:pStyle w:val="ListParagraph"/>
+        <w:numPr>
+          <w:ilvl w:val="1"/>
+          <w:numId w:val="2"/>
+        </w:numPr>
+        <w:rPr/>
+      </w:pPr>
+      <w:r>
+        <w:rPr/>
+        <w:t xml:space="preserve">150000 </w:t>
+      </w:r>
+      <w:r>
+        <w:rPr/>
+        <w:t>dòng</w:t>
+      </w:r>
+      <w:r>
+        <w:rPr/>
+        <w:t xml:space="preserve"> </w:t>
+      </w:r>
+      <w:r>
+        <w:rPr/>
+        <w:t>có</w:t>
+      </w:r>
+      <w:r>
+        <w:rPr/>
+        <w:t xml:space="preserve"> </w:t>
+      </w:r>
+      <w:r>
+        <w:rPr/>
+        <w:t>dữ</w:t>
+      </w:r>
+      <w:r>
+        <w:rPr/>
+        <w:t xml:space="preserve"> </w:t>
+      </w:r>
+      <w:r>
+        <w:rPr/>
+        <w:t>liệu</w:t>
+      </w:r>
+    </w:p>
+    <w:p>
+      <w:pPr>
+        <w:pStyle w:val="ListParagraph"/>
+        <w:numPr>
+          <w:ilvl w:val="1"/>
+          <w:numId w:val="2"/>
+        </w:numPr>
+        <w:rPr/>
+      </w:pPr>
+      <w:r>
+        <w:rPr/>
+        <w:t>Gồm</w:t>
+      </w:r>
+      <w:r>
+        <w:rPr/>
+        <w:t xml:space="preserve"> 5 </w:t>
+      </w:r>
+      <w:r>
+        <w:rPr/>
+        <w:t>giá</w:t>
+      </w:r>
+      <w:r>
+        <w:rPr/>
+        <w:t xml:space="preserve"> </w:t>
+      </w:r>
+      <w:r>
+        <w:rPr/>
+        <w:t>trị</w:t>
+      </w:r>
+      <w:r>
+        <w:rPr/>
+        <w:t xml:space="preserve"> </w:t>
+      </w:r>
+      <w:r>
+        <w:rPr/>
+        <w:t>duy</w:t>
+      </w:r>
+      <w:r>
+        <w:rPr/>
+        <w:t xml:space="preserve"> </w:t>
+      </w:r>
+      <w:r>
+        <w:rPr/>
+        <w:t>nhất</w:t>
+      </w:r>
+    </w:p>
+    <w:p>
+      <w:pPr>
+        <w:pStyle w:val="ListParagraph"/>
+        <w:numPr>
+          <w:ilvl w:val="1"/>
+          <w:numId w:val="2"/>
+        </w:numPr>
+        <w:rPr/>
+      </w:pPr>
+      <w:r>
+        <w:rPr/>
+        <w:t xml:space="preserve">Các </w:t>
+      </w:r>
+      <w:r>
+        <w:rPr/>
+        <w:t>giá</w:t>
+      </w:r>
+      <w:r>
+        <w:rPr/>
+        <w:t xml:space="preserve"> </w:t>
+      </w:r>
+      <w:r>
+        <w:rPr/>
+        <w:t>trị</w:t>
+      </w:r>
+      <w:r>
+        <w:rPr/>
+        <w:t>: Completed</w:t>
+      </w:r>
+      <w:r>
+        <w:rPr/>
+        <w:t xml:space="preserve"> </w:t>
+      </w:r>
+      <w:r>
+        <w:rPr/>
+        <w:t>(62%), Cancelled by Driver</w:t>
+      </w:r>
+      <w:r>
+        <w:rPr/>
+        <w:t xml:space="preserve"> </w:t>
+      </w:r>
+      <w:r>
+        <w:rPr/>
+        <w:t>(18%), No Driver Found</w:t>
+      </w:r>
+      <w:r>
+        <w:rPr/>
+        <w:t xml:space="preserve"> </w:t>
+      </w:r>
+      <w:r>
+        <w:rPr/>
+        <w:t>(7%), Cancelled by Customer</w:t>
+      </w:r>
+      <w:r>
+        <w:rPr/>
+        <w:t xml:space="preserve"> </w:t>
+      </w:r>
+      <w:r>
+        <w:rPr/>
+        <w:t>(7%), Incomplete</w:t>
+      </w:r>
+      <w:r>
+        <w:rPr/>
+        <w:t xml:space="preserve"> </w:t>
+      </w:r>
+      <w:r>
+        <w:rPr/>
+        <w:t>(6%)</w:t>
+      </w:r>
+    </w:p>
+    <w:p>
+      <w:pPr>
+        <w:pStyle w:val="ListParagraph"/>
+        <w:numPr>
+          <w:ilvl w:val="0"/>
+          <w:numId w:val="2"/>
+        </w:numPr>
+        <w:rPr>
+          <w:color w:val="auto"/>
+        </w:rPr>
+      </w:pPr>
+      <w:r>
+        <w:rPr>
+          <w:color w:val="auto"/>
+        </w:rPr>
+        <w:t>Cancelled Rides by Customer</w:t>
+      </w:r>
+    </w:p>
+    <w:p>
+      <w:pPr>
+        <w:pStyle w:val="ListParagraph"/>
+        <w:numPr>
+          <w:ilvl w:val="1"/>
+          <w:numId w:val="2"/>
+        </w:numPr>
+        <w:rPr>
+          <w:color w:val="auto"/>
+        </w:rPr>
+      </w:pPr>
+      <w:r>
+        <w:rPr>
+          <w:color w:val="auto"/>
+        </w:rPr>
+        <w:t xml:space="preserve">10500 </w:t>
+      </w:r>
+      <w:r>
+        <w:rPr>
+          <w:color w:val="auto"/>
+        </w:rPr>
+        <w:t>dòng</w:t>
+      </w:r>
+      <w:r>
+        <w:rPr>
+          <w:color w:val="auto"/>
+        </w:rPr>
+        <w:t xml:space="preserve"> </w:t>
+      </w:r>
+      <w:r>
+        <w:rPr>
+          <w:color w:val="auto"/>
+        </w:rPr>
+        <w:t>có</w:t>
+      </w:r>
+      <w:r>
+        <w:rPr>
+          <w:color w:val="auto"/>
+        </w:rPr>
+        <w:t xml:space="preserve"> </w:t>
+      </w:r>
+      <w:r>
+        <w:rPr>
+          <w:color w:val="auto"/>
+        </w:rPr>
+        <w:t>dữ</w:t>
+      </w:r>
+      <w:r>
+        <w:rPr>
+          <w:color w:val="auto"/>
+        </w:rPr>
+        <w:t xml:space="preserve"> </w:t>
+      </w:r>
+      <w:r>
+        <w:rPr>
+          <w:color w:val="auto"/>
+        </w:rPr>
+        <w:t>liệu</w:t>
+      </w:r>
+      <w:r>
+        <w:rPr>
+          <w:color w:val="auto"/>
+        </w:rPr>
+        <w:t xml:space="preserve"> (7%)</w:t>
+      </w:r>
+    </w:p>
+    <w:p>
+      <w:pPr>
+        <w:pStyle w:val="ListParagraph"/>
+        <w:numPr>
+          <w:ilvl w:val="1"/>
+          <w:numId w:val="2"/>
+        </w:numPr>
+        <w:rPr>
+          <w:color w:val="auto"/>
+        </w:rPr>
+      </w:pPr>
+      <w:r>
+        <w:rPr>
+          <w:color w:val="auto"/>
+        </w:rPr>
+        <w:t>Min: 1</w:t>
+      </w:r>
+    </w:p>
+    <w:p>
+      <w:pPr>
+        <w:pStyle w:val="ListParagraph"/>
+        <w:numPr>
+          <w:ilvl w:val="1"/>
+          <w:numId w:val="2"/>
+        </w:numPr>
+        <w:rPr>
+          <w:color w:val="auto"/>
+        </w:rPr>
+      </w:pPr>
+      <w:r>
+        <w:rPr>
+          <w:color w:val="auto"/>
+        </w:rPr>
+        <w:t>Max: 1</w:t>
+      </w:r>
+    </w:p>
+    <w:p>
+      <w:pPr>
+        <w:pStyle w:val="ListParagraph"/>
+        <w:numPr>
+          <w:ilvl w:val="1"/>
+          <w:numId w:val="2"/>
+        </w:numPr>
+        <w:rPr>
+          <w:color w:val="auto"/>
+        </w:rPr>
+      </w:pPr>
+      <w:r>
+        <w:rPr>
+          <w:color w:val="auto"/>
+        </w:rPr>
+        <w:t>Avg: 1</w:t>
+      </w:r>
+    </w:p>
+    <w:p>
+      <w:pPr>
+        <w:pStyle w:val="ListParagraph"/>
+        <w:numPr>
+          <w:ilvl w:val="0"/>
+          <w:numId w:val="2"/>
+        </w:numPr>
+        <w:rPr>
+          <w:color w:val="auto"/>
+        </w:rPr>
+      </w:pPr>
+      <w:r>
+        <w:rPr>
+          <w:color w:val="auto"/>
+        </w:rPr>
+        <w:t>Cancelled Rides by Driver</w:t>
+      </w:r>
+    </w:p>
+    <w:p>
+      <w:pPr>
+        <w:pStyle w:val="ListParagraph"/>
+        <w:numPr>
+          <w:ilvl w:val="1"/>
+          <w:numId w:val="2"/>
+        </w:numPr>
+        <w:rPr>
+          <w:color w:val="auto"/>
+        </w:rPr>
+      </w:pPr>
+      <w:r>
+        <w:rPr>
+          <w:color w:val="auto"/>
+        </w:rPr>
+        <w:t xml:space="preserve">27000 </w:t>
+      </w:r>
+      <w:r>
+        <w:rPr>
+          <w:color w:val="auto"/>
+        </w:rPr>
+        <w:t>dòng</w:t>
+      </w:r>
+      <w:r>
+        <w:rPr>
+          <w:color w:val="auto"/>
+        </w:rPr>
+        <w:t xml:space="preserve"> </w:t>
+      </w:r>
+      <w:r>
+        <w:rPr>
+          <w:color w:val="auto"/>
+        </w:rPr>
+        <w:t>có</w:t>
+      </w:r>
+      <w:r>
+        <w:rPr>
+          <w:color w:val="auto"/>
+        </w:rPr>
+        <w:t xml:space="preserve"> </w:t>
+      </w:r>
+      <w:r>
+        <w:rPr>
+          <w:color w:val="auto"/>
+        </w:rPr>
+        <w:t>dữ</w:t>
+      </w:r>
+      <w:r>
+        <w:rPr>
+          <w:color w:val="auto"/>
+        </w:rPr>
+        <w:t xml:space="preserve"> </w:t>
+      </w:r>
+      <w:r>
+        <w:rPr>
+          <w:color w:val="auto"/>
+        </w:rPr>
+        <w:t>liệu</w:t>
+      </w:r>
+      <w:r>
+        <w:rPr>
+          <w:color w:val="auto"/>
+        </w:rPr>
+        <w:t xml:space="preserve"> (18%)</w:t>
+      </w:r>
+    </w:p>
+    <w:p>
+      <w:pPr>
+        <w:pStyle w:val="ListParagraph"/>
+        <w:numPr>
+          <w:ilvl w:val="1"/>
+          <w:numId w:val="2"/>
+        </w:numPr>
+        <w:rPr>
+          <w:color w:val="auto"/>
+        </w:rPr>
+      </w:pPr>
+      <w:r>
+        <w:rPr>
+          <w:color w:val="auto"/>
+        </w:rPr>
+        <w:t>Min: 1</w:t>
+      </w:r>
+    </w:p>
+    <w:p>
+      <w:pPr>
+        <w:pStyle w:val="ListParagraph"/>
+        <w:numPr>
+          <w:ilvl w:val="1"/>
+          <w:numId w:val="2"/>
+        </w:numPr>
+        <w:rPr>
+          <w:color w:val="auto"/>
+        </w:rPr>
+      </w:pPr>
+      <w:r>
+        <w:rPr>
+          <w:color w:val="auto"/>
+        </w:rPr>
+        <w:t>Max: 1</w:t>
+      </w:r>
+    </w:p>
+    <w:p>
+      <w:pPr>
+        <w:pStyle w:val="ListParagraph"/>
+        <w:numPr>
+          <w:ilvl w:val="1"/>
+          <w:numId w:val="2"/>
+        </w:numPr>
+        <w:rPr>
+          <w:color w:val="auto"/>
+        </w:rPr>
+      </w:pPr>
+      <w:r>
+        <w:rPr>
+          <w:color w:val="auto"/>
+        </w:rPr>
+        <w:t>Avg: 1</w:t>
+      </w:r>
+    </w:p>
+    <w:p>
+      <w:pPr>
+        <w:pStyle w:val="ListParagraph"/>
+        <w:numPr>
+          <w:ilvl w:val="0"/>
+          <w:numId w:val="2"/>
+        </w:numPr>
+        <w:rPr>
+          <w:color w:val="auto"/>
+        </w:rPr>
+      </w:pPr>
+      <w:r>
+        <w:rPr>
+          <w:color w:val="auto"/>
+        </w:rPr>
+        <w:t>Incomplete Rides</w:t>
+      </w:r>
+    </w:p>
+    <w:p>
+      <w:pPr>
+        <w:pStyle w:val="ListParagraph"/>
+        <w:numPr>
+          <w:ilvl w:val="1"/>
+          <w:numId w:val="2"/>
+        </w:numPr>
+        <w:rPr>
+          <w:color w:val="auto"/>
+        </w:rPr>
+      </w:pPr>
+      <w:r>
+        <w:rPr>
+          <w:color w:val="auto"/>
+        </w:rPr>
+        <w:t xml:space="preserve">9000 </w:t>
+      </w:r>
+      <w:r>
+        <w:rPr>
+          <w:color w:val="auto"/>
+        </w:rPr>
+        <w:t>dòng</w:t>
+      </w:r>
+      <w:r>
+        <w:rPr>
+          <w:color w:val="auto"/>
+        </w:rPr>
+        <w:t xml:space="preserve"> </w:t>
+      </w:r>
+      <w:r>
+        <w:rPr>
+          <w:color w:val="auto"/>
+        </w:rPr>
+        <w:t>có</w:t>
+      </w:r>
+      <w:r>
+        <w:rPr>
+          <w:color w:val="auto"/>
+        </w:rPr>
+        <w:t xml:space="preserve"> </w:t>
+      </w:r>
+      <w:r>
+        <w:rPr>
+          <w:color w:val="auto"/>
+        </w:rPr>
+        <w:t>dữ</w:t>
+      </w:r>
+      <w:r>
+        <w:rPr>
+          <w:color w:val="auto"/>
+        </w:rPr>
+        <w:t xml:space="preserve"> </w:t>
+      </w:r>
+      <w:r>
+        <w:rPr>
+          <w:color w:val="auto"/>
+        </w:rPr>
+        <w:t>liệu</w:t>
+      </w:r>
+      <w:r>
+        <w:rPr>
+          <w:color w:val="auto"/>
+        </w:rPr>
+        <w:t xml:space="preserve"> (6%)</w:t>
+      </w:r>
+    </w:p>
+    <w:p>
+      <w:pPr>
+        <w:pStyle w:val="ListParagraph"/>
+        <w:numPr>
+          <w:ilvl w:val="1"/>
+          <w:numId w:val="2"/>
+        </w:numPr>
+        <w:rPr>
+          <w:color w:val="auto"/>
+        </w:rPr>
+      </w:pPr>
+      <w:r>
+        <w:rPr>
+          <w:color w:val="auto"/>
+        </w:rPr>
+        <w:t>Min: 1</w:t>
+      </w:r>
+    </w:p>
+    <w:p>
+      <w:pPr>
+        <w:pStyle w:val="ListParagraph"/>
+        <w:numPr>
+          <w:ilvl w:val="1"/>
+          <w:numId w:val="2"/>
+        </w:numPr>
+        <w:rPr>
+          <w:color w:val="auto"/>
+        </w:rPr>
+      </w:pPr>
+      <w:r>
+        <w:rPr>
+          <w:color w:val="auto"/>
+        </w:rPr>
+        <w:t>Max: 1</w:t>
+      </w:r>
+    </w:p>
+    <w:p>
+      <w:pPr>
+        <w:pStyle w:val="ListParagraph"/>
+        <w:numPr>
+          <w:ilvl w:val="1"/>
+          <w:numId w:val="2"/>
+        </w:numPr>
+        <w:rPr>
+          <w:color w:val="auto"/>
+        </w:rPr>
+      </w:pPr>
+      <w:r>
+        <w:rPr>
+          <w:color w:val="auto"/>
+        </w:rPr>
+        <w:t>Avg: 1</w:t>
+      </w:r>
+    </w:p>
+    <w:p>
+      <w:pPr>
+        <w:pStyle w:val="ListParagraph"/>
+        <w:numPr>
+          <w:ilvl w:val="0"/>
+          <w:numId w:val="2"/>
+        </w:numPr>
+        <w:rPr/>
+      </w:pPr>
+      <w:r>
+        <w:rPr/>
+        <w:t>Reason for cancelling by Customer</w:t>
+      </w:r>
+    </w:p>
+    <w:p>
+      <w:pPr>
+        <w:pStyle w:val="ListParagraph"/>
+        <w:numPr>
+          <w:ilvl w:val="1"/>
+          <w:numId w:val="2"/>
+        </w:numPr>
+        <w:rPr/>
+      </w:pPr>
+      <w:r>
+        <w:rPr/>
+        <w:t xml:space="preserve">150000 </w:t>
+      </w:r>
+      <w:r>
+        <w:rPr/>
+        <w:t>dòng</w:t>
+      </w:r>
+      <w:r>
+        <w:rPr/>
+        <w:t xml:space="preserve"> </w:t>
+      </w:r>
+      <w:r>
+        <w:rPr/>
+        <w:t>có</w:t>
+      </w:r>
+      <w:r>
+        <w:rPr/>
+        <w:t xml:space="preserve"> </w:t>
+      </w:r>
+      <w:r>
+        <w:rPr/>
+        <w:t>dữ</w:t>
+      </w:r>
+      <w:r>
+        <w:rPr/>
+        <w:t xml:space="preserve"> </w:t>
+      </w:r>
+      <w:r>
+        <w:rPr/>
+        <w:t>liệu</w:t>
+      </w:r>
+      <w:r>
+        <w:rPr/>
+        <w:t xml:space="preserve"> (bao </w:t>
+      </w:r>
+      <w:r>
+        <w:rPr/>
+        <w:t>gồm</w:t>
+      </w:r>
+      <w:r>
+        <w:rPr/>
+        <w:t xml:space="preserve"> </w:t>
+      </w:r>
+      <w:r>
+        <w:rPr/>
+        <w:t>139500</w:t>
+      </w:r>
+      <w:r>
+        <w:rPr/>
+        <w:t xml:space="preserve"> “null”, 10500 </w:t>
+      </w:r>
+      <w:r>
+        <w:rPr/>
+        <w:t>dòng</w:t>
+      </w:r>
+      <w:r>
+        <w:rPr/>
+        <w:t xml:space="preserve"> </w:t>
+      </w:r>
+      <w:r>
+        <w:rPr/>
+        <w:t>có</w:t>
+      </w:r>
+      <w:r>
+        <w:rPr/>
+        <w:t xml:space="preserve"> </w:t>
+      </w:r>
+      <w:r>
+        <w:rPr/>
+        <w:t>dữ</w:t>
+      </w:r>
+      <w:r>
+        <w:rPr/>
+        <w:t xml:space="preserve"> </w:t>
+      </w:r>
+      <w:r>
+        <w:rPr/>
+        <w:t>liệu</w:t>
+      </w:r>
+      <w:r>
+        <w:rPr/>
+        <w:t xml:space="preserve"> </w:t>
+      </w:r>
+      <w:r>
+        <w:rPr/>
+        <w:t>thật</w:t>
+      </w:r>
+      <w:r>
+        <w:rPr/>
+        <w:t xml:space="preserve"> (7%))</w:t>
+      </w:r>
+    </w:p>
+    <w:p>
+      <w:pPr>
+        <w:pStyle w:val="ListParagraph"/>
+        <w:numPr>
+          <w:ilvl w:val="1"/>
+          <w:numId w:val="2"/>
+        </w:numPr>
+        <w:rPr/>
+      </w:pPr>
+      <w:r>
+        <w:rPr/>
+        <w:t>Gồm 6 giá trị duy nhất, trong đó có “null” cũng được coi là giá trị</w:t>
+      </w:r>
+    </w:p>
+    <w:p>
+      <w:pPr>
+        <w:pStyle w:val="ListParagraph"/>
+        <w:numPr>
+          <w:ilvl w:val="1"/>
+          <w:numId w:val="2"/>
+        </w:numPr>
+        <w:rPr/>
+      </w:pPr>
+      <w:r>
+        <w:rPr/>
+        <w:t xml:space="preserve">Các </w:t>
+      </w:r>
+      <w:r>
+        <w:rPr/>
+        <w:t>giá</w:t>
+      </w:r>
+      <w:r>
+        <w:rPr/>
+        <w:t xml:space="preserve"> </w:t>
+      </w:r>
+      <w:r>
+        <w:rPr/>
+        <w:t>trị</w:t>
+      </w:r>
+      <w:r>
+        <w:rPr/>
+        <w:t>: Wrong Address (1.57%), Change of plans (1.57%), Driver is not moving towards pickup (1.56%), Driver asked to cancel (1.53%), AC is not working (0.77%), null (93%)</w:t>
+      </w:r>
+    </w:p>
+    <w:p>
+      <w:pPr>
+        <w:pStyle w:val="ListParagraph"/>
+        <w:numPr>
+          <w:ilvl w:val="1"/>
+          <w:numId w:val="2"/>
+        </w:numPr>
+        <w:rPr>
+          <w:color w:val="auto"/>
+        </w:rPr>
+      </w:pPr>
+      <w:r>
+        <w:rPr>
+          <w:color w:val="auto"/>
+          <w:u w:val="single"/>
+        </w:rPr>
+        <w:t>Issue</w:t>
+      </w:r>
+      <w:r>
+        <w:rPr>
+          <w:color w:val="auto"/>
+        </w:rPr>
+        <w:t xml:space="preserve">: “null” </w:t>
+      </w:r>
+      <w:r>
+        <w:rPr>
+          <w:color w:val="auto"/>
+        </w:rPr>
+        <w:t>được</w:t>
+      </w:r>
+      <w:r>
+        <w:rPr>
+          <w:color w:val="auto"/>
+        </w:rPr>
+        <w:t xml:space="preserve"> </w:t>
+      </w:r>
+      <w:r>
+        <w:rPr>
+          <w:color w:val="auto"/>
+        </w:rPr>
+        <w:t>coi</w:t>
+      </w:r>
+      <w:r>
+        <w:rPr>
+          <w:color w:val="auto"/>
+        </w:rPr>
+        <w:t xml:space="preserve"> </w:t>
+      </w:r>
+      <w:r>
+        <w:rPr>
+          <w:color w:val="auto"/>
+        </w:rPr>
+        <w:t>là</w:t>
+      </w:r>
+      <w:r>
+        <w:rPr>
+          <w:color w:val="auto"/>
+        </w:rPr>
+        <w:t xml:space="preserve"> </w:t>
+      </w:r>
+      <w:r>
+        <w:rPr>
+          <w:color w:val="auto"/>
+        </w:rPr>
+        <w:t>giá</w:t>
+      </w:r>
+      <w:r>
+        <w:rPr>
+          <w:color w:val="auto"/>
+        </w:rPr>
+        <w:t xml:space="preserve"> </w:t>
+      </w:r>
+      <w:r>
+        <w:rPr>
+          <w:color w:val="auto"/>
+        </w:rPr>
+        <w:t>trị</w:t>
+      </w:r>
+      <w:r>
+        <w:rPr>
+          <w:color w:val="auto"/>
+        </w:rPr>
+        <w:t xml:space="preserve"> </w:t>
+      </w:r>
+      <w:r>
+        <w:rPr>
+          <w:color w:val="auto"/>
+        </w:rPr>
+        <w:t>hợp</w:t>
+      </w:r>
+      <w:r>
+        <w:rPr>
+          <w:color w:val="auto"/>
+        </w:rPr>
+        <w:t xml:space="preserve"> </w:t>
+      </w:r>
+      <w:r>
+        <w:rPr>
+          <w:color w:val="auto"/>
+        </w:rPr>
+        <w:t>lệ</w:t>
+      </w:r>
+    </w:p>
+    <w:p>
+      <w:pPr>
+        <w:pStyle w:val="ListParagraph"/>
+        <w:numPr>
+          <w:ilvl w:val="0"/>
+          <w:numId w:val="2"/>
+        </w:numPr>
+        <w:rPr>
+          <w:color w:val="auto"/>
+        </w:rPr>
+      </w:pPr>
+      <w:r>
+        <w:rPr>
+          <w:color w:val="auto"/>
+        </w:rPr>
+        <w:t>Driver Cancellation Reason</w:t>
+      </w:r>
+      <w:r>
+        <w:rPr>
+          <w:color w:val="auto"/>
+        </w:rPr>
+        <w:t xml:space="preserve"> </w:t>
+      </w:r>
+    </w:p>
+    <w:p>
+      <w:pPr>
+        <w:pStyle w:val="ListParagraph"/>
+        <w:numPr>
+          <w:ilvl w:val="1"/>
+          <w:numId w:val="2"/>
+        </w:numPr>
+        <w:rPr>
+          <w:color w:val="auto"/>
+        </w:rPr>
+      </w:pPr>
+      <w:r>
+        <w:rPr>
+          <w:color w:val="auto"/>
+        </w:rPr>
+        <w:t xml:space="preserve">150000 </w:t>
+      </w:r>
+      <w:r>
+        <w:rPr>
+          <w:color w:val="auto"/>
+        </w:rPr>
+        <w:t>dòng</w:t>
+      </w:r>
+      <w:r>
+        <w:rPr>
+          <w:color w:val="auto"/>
+        </w:rPr>
+        <w:t xml:space="preserve"> </w:t>
+      </w:r>
+      <w:r>
+        <w:rPr>
+          <w:color w:val="auto"/>
+        </w:rPr>
+        <w:t>có</w:t>
+      </w:r>
+      <w:r>
+        <w:rPr>
+          <w:color w:val="auto"/>
+        </w:rPr>
+        <w:t xml:space="preserve"> </w:t>
+      </w:r>
+      <w:r>
+        <w:rPr>
+          <w:color w:val="auto"/>
+        </w:rPr>
+        <w:t>dữ</w:t>
+      </w:r>
+      <w:r>
+        <w:rPr>
+          <w:color w:val="auto"/>
+        </w:rPr>
+        <w:t xml:space="preserve"> </w:t>
+      </w:r>
+      <w:r>
+        <w:rPr>
+          <w:color w:val="auto"/>
+        </w:rPr>
+        <w:t>liệu</w:t>
+      </w:r>
+      <w:r>
+        <w:rPr>
+          <w:color w:val="auto"/>
+        </w:rPr>
+        <w:t xml:space="preserve"> (bao </w:t>
+      </w:r>
+      <w:r>
+        <w:rPr>
+          <w:color w:val="auto"/>
+        </w:rPr>
+        <w:t>gồm</w:t>
+      </w:r>
+      <w:r>
+        <w:rPr>
+          <w:color w:val="auto"/>
+        </w:rPr>
+        <w:t xml:space="preserve"> </w:t>
+      </w:r>
+      <w:r>
+        <w:rPr>
+          <w:color w:val="auto"/>
+        </w:rPr>
+        <w:t>123000</w:t>
+      </w:r>
+      <w:r>
+        <w:rPr>
+          <w:color w:val="auto"/>
+        </w:rPr>
+        <w:t xml:space="preserve"> “null”, 27000 </w:t>
+      </w:r>
+      <w:r>
+        <w:rPr>
+          <w:color w:val="auto"/>
+        </w:rPr>
+        <w:t>dòng</w:t>
+      </w:r>
+      <w:r>
+        <w:rPr>
+          <w:color w:val="auto"/>
+        </w:rPr>
+        <w:t xml:space="preserve"> </w:t>
+      </w:r>
+      <w:r>
+        <w:rPr>
+          <w:color w:val="auto"/>
+        </w:rPr>
+        <w:t>có</w:t>
+      </w:r>
+      <w:r>
+        <w:rPr>
+          <w:color w:val="auto"/>
+        </w:rPr>
+        <w:t xml:space="preserve"> </w:t>
+      </w:r>
+      <w:r>
+        <w:rPr>
+          <w:color w:val="auto"/>
+        </w:rPr>
+        <w:t>dữ</w:t>
+      </w:r>
+      <w:r>
+        <w:rPr>
+          <w:color w:val="auto"/>
+        </w:rPr>
+        <w:t xml:space="preserve"> </w:t>
+      </w:r>
+      <w:r>
+        <w:rPr>
+          <w:color w:val="auto"/>
+        </w:rPr>
+        <w:t>liệu</w:t>
+      </w:r>
+      <w:r>
+        <w:rPr>
+          <w:color w:val="auto"/>
+        </w:rPr>
+        <w:t xml:space="preserve"> </w:t>
+      </w:r>
+      <w:r>
+        <w:rPr>
+          <w:color w:val="auto"/>
+        </w:rPr>
+        <w:t>thật</w:t>
+      </w:r>
+      <w:r>
+        <w:rPr>
+          <w:color w:val="auto"/>
+        </w:rPr>
+        <w:t xml:space="preserve"> (18%))</w:t>
+      </w:r>
+    </w:p>
+    <w:p>
+      <w:pPr>
+        <w:pStyle w:val="ListParagraph"/>
+        <w:numPr>
+          <w:ilvl w:val="1"/>
+          <w:numId w:val="2"/>
+        </w:numPr>
+        <w:rPr>
+          <w:color w:val="auto"/>
+        </w:rPr>
+      </w:pPr>
+      <w:r>
+        <w:rPr>
+          <w:color w:val="auto"/>
+        </w:rPr>
+        <w:t>Gồm</w:t>
+      </w:r>
+      <w:r>
+        <w:rPr>
+          <w:color w:val="auto"/>
+        </w:rPr>
+        <w:t xml:space="preserve"> 5 </w:t>
+      </w:r>
+      <w:r>
+        <w:rPr>
+          <w:color w:val="auto"/>
+        </w:rPr>
+        <w:t>giá</w:t>
+      </w:r>
+      <w:r>
+        <w:rPr>
+          <w:color w:val="auto"/>
+        </w:rPr>
+        <w:t xml:space="preserve"> </w:t>
+      </w:r>
+      <w:r>
+        <w:rPr>
+          <w:color w:val="auto"/>
+        </w:rPr>
+        <w:t>trị</w:t>
+      </w:r>
+      <w:r>
+        <w:rPr>
+          <w:color w:val="auto"/>
+        </w:rPr>
+        <w:t xml:space="preserve"> </w:t>
+      </w:r>
+      <w:r>
+        <w:rPr>
+          <w:color w:val="auto"/>
+        </w:rPr>
+        <w:t>duy</w:t>
+      </w:r>
+      <w:r>
+        <w:rPr>
+          <w:color w:val="auto"/>
+        </w:rPr>
+        <w:t xml:space="preserve"> </w:t>
+      </w:r>
+      <w:r>
+        <w:rPr>
+          <w:color w:val="auto"/>
+        </w:rPr>
+        <w:t>nhất</w:t>
+      </w:r>
+      <w:r>
+        <w:rPr>
+          <w:color w:val="auto"/>
+        </w:rPr>
+        <w:t>, trong đó “null” cũng được coi là giá trị</w:t>
+      </w:r>
+    </w:p>
+    <w:p>
+      <w:pPr>
+        <w:pStyle w:val="ListParagraph"/>
+        <w:numPr>
+          <w:ilvl w:val="1"/>
+          <w:numId w:val="2"/>
+        </w:numPr>
+        <w:rPr>
+          <w:color w:val="auto"/>
+        </w:rPr>
+      </w:pPr>
+      <w:r>
+        <w:rPr>
+          <w:color w:val="auto"/>
+        </w:rPr>
+        <w:t xml:space="preserve">Các </w:t>
+      </w:r>
+      <w:r>
+        <w:rPr>
+          <w:color w:val="auto"/>
+        </w:rPr>
+        <w:t>giá</w:t>
+      </w:r>
+      <w:r>
+        <w:rPr>
+          <w:color w:val="auto"/>
+        </w:rPr>
+        <w:t xml:space="preserve"> </w:t>
+      </w:r>
+      <w:r>
+        <w:rPr>
+          <w:color w:val="auto"/>
+        </w:rPr>
+        <w:t>trị</w:t>
+      </w:r>
+      <w:r>
+        <w:rPr>
+          <w:color w:val="auto"/>
+        </w:rPr>
+        <w:t>: Customer related issue (4.56%), The customer was coughing/sick (4.5%), Personal &amp; Car related issues</w:t>
+      </w:r>
+      <w:r>
+        <w:rPr>
+          <w:color w:val="auto"/>
+        </w:rPr>
+        <w:t xml:space="preserve"> (4.48%)</w:t>
+      </w:r>
+      <w:r>
+        <w:rPr>
+          <w:color w:val="auto"/>
+        </w:rPr>
+        <w:t xml:space="preserve">, </w:t>
+      </w:r>
+      <w:r>
+        <w:rPr>
+          <w:color w:val="auto"/>
+        </w:rPr>
+        <w:t xml:space="preserve">More than </w:t>
+      </w:r>
+      <w:r>
+        <w:rPr>
+          <w:color w:val="auto"/>
+        </w:rPr>
+        <w:t>permitted</w:t>
+      </w:r>
+      <w:r>
+        <w:rPr>
+          <w:color w:val="auto"/>
+        </w:rPr>
+        <w:t xml:space="preserve"> people in there</w:t>
+      </w:r>
+      <w:r>
+        <w:rPr>
+          <w:color w:val="auto"/>
+        </w:rPr>
+        <w:t xml:space="preserve"> (4.46%)</w:t>
+      </w:r>
+      <w:r>
+        <w:rPr>
+          <w:color w:val="auto"/>
+        </w:rPr>
+        <w:t>, null (82%)</w:t>
+      </w:r>
+    </w:p>
+    <w:p>
+      <w:pPr>
+        <w:pStyle w:val="ListParagraph"/>
+        <w:numPr>
+          <w:ilvl w:val="1"/>
+          <w:numId w:val="2"/>
+        </w:numPr>
+        <w:rPr>
+          <w:color w:val="auto"/>
+        </w:rPr>
+      </w:pPr>
+      <w:r>
+        <w:rPr>
+          <w:color w:val="auto"/>
+          <w:u w:val="single"/>
+        </w:rPr>
+        <w:t>Issue</w:t>
+      </w:r>
+      <w:r>
+        <w:rPr>
+          <w:color w:val="auto"/>
+        </w:rPr>
+        <w:t xml:space="preserve">: “null” </w:t>
+      </w:r>
+      <w:r>
+        <w:rPr>
+          <w:color w:val="auto"/>
+        </w:rPr>
+        <w:t>được</w:t>
+      </w:r>
+      <w:r>
+        <w:rPr>
+          <w:color w:val="auto"/>
+        </w:rPr>
+        <w:t xml:space="preserve"> </w:t>
+      </w:r>
+      <w:r>
+        <w:rPr>
+          <w:color w:val="auto"/>
+        </w:rPr>
+        <w:t>coi</w:t>
+      </w:r>
+      <w:r>
+        <w:rPr>
+          <w:color w:val="auto"/>
+        </w:rPr>
+        <w:t xml:space="preserve"> </w:t>
+      </w:r>
+      <w:r>
+        <w:rPr>
+          <w:color w:val="auto"/>
+        </w:rPr>
+        <w:t>là</w:t>
+      </w:r>
+      <w:r>
+        <w:rPr>
+          <w:color w:val="auto"/>
+        </w:rPr>
+        <w:t xml:space="preserve"> </w:t>
+      </w:r>
+      <w:r>
+        <w:rPr>
+          <w:color w:val="auto"/>
+        </w:rPr>
+        <w:t>giá</w:t>
+      </w:r>
+      <w:r>
+        <w:rPr>
+          <w:color w:val="auto"/>
+        </w:rPr>
+        <w:t xml:space="preserve"> </w:t>
+      </w:r>
+      <w:r>
+        <w:rPr>
+          <w:color w:val="auto"/>
+        </w:rPr>
+        <w:t>trị</w:t>
+      </w:r>
+      <w:r>
+        <w:rPr>
+          <w:color w:val="auto"/>
+        </w:rPr>
+        <w:t xml:space="preserve"> </w:t>
+      </w:r>
+      <w:r>
+        <w:rPr>
+          <w:color w:val="auto"/>
+        </w:rPr>
+        <w:t>hợp</w:t>
+      </w:r>
+      <w:r>
+        <w:rPr>
+          <w:color w:val="auto"/>
+        </w:rPr>
+        <w:t xml:space="preserve"> </w:t>
+      </w:r>
+      <w:r>
+        <w:rPr>
+          <w:color w:val="auto"/>
+        </w:rPr>
+        <w:t>lệ</w:t>
+      </w:r>
+    </w:p>
+    <w:p>
+      <w:pPr>
+        <w:pStyle w:val="ListParagraph"/>
+        <w:numPr>
+          <w:ilvl w:val="0"/>
+          <w:numId w:val="2"/>
+        </w:numPr>
+        <w:rPr>
+          <w:color w:val="auto"/>
+        </w:rPr>
+      </w:pPr>
+      <w:r>
+        <w:rPr>
+          <w:color w:val="auto"/>
+        </w:rPr>
+        <w:t>Incomplete Rides Reason</w:t>
+      </w:r>
+    </w:p>
+    <w:p>
+      <w:pPr>
+        <w:pStyle w:val="ListParagraph"/>
+        <w:numPr>
+          <w:ilvl w:val="1"/>
+          <w:numId w:val="2"/>
+        </w:numPr>
+        <w:rPr>
+          <w:color w:val="auto"/>
+        </w:rPr>
+      </w:pPr>
+      <w:r>
+        <w:rPr>
+          <w:color w:val="auto"/>
+        </w:rPr>
+        <w:t xml:space="preserve">150000 </w:t>
+      </w:r>
+      <w:r>
+        <w:rPr>
+          <w:color w:val="auto"/>
+        </w:rPr>
+        <w:t>dòng</w:t>
+      </w:r>
+      <w:r>
+        <w:rPr>
+          <w:color w:val="auto"/>
+        </w:rPr>
+        <w:t xml:space="preserve"> </w:t>
+      </w:r>
+      <w:r>
+        <w:rPr>
+          <w:color w:val="auto"/>
+        </w:rPr>
+        <w:t>có</w:t>
+      </w:r>
+      <w:r>
+        <w:rPr>
+          <w:color w:val="auto"/>
+        </w:rPr>
+        <w:t xml:space="preserve"> </w:t>
+      </w:r>
+      <w:r>
+        <w:rPr>
+          <w:color w:val="auto"/>
+        </w:rPr>
+        <w:t>dữ</w:t>
+      </w:r>
+      <w:r>
+        <w:rPr>
+          <w:color w:val="auto"/>
+        </w:rPr>
+        <w:t xml:space="preserve"> </w:t>
+      </w:r>
+      <w:r>
+        <w:rPr>
+          <w:color w:val="auto"/>
+        </w:rPr>
+        <w:t>liệu</w:t>
+      </w:r>
+      <w:r>
+        <w:rPr>
+          <w:color w:val="auto"/>
+        </w:rPr>
+        <w:t xml:space="preserve"> (bao </w:t>
+      </w:r>
+      <w:r>
+        <w:rPr>
+          <w:color w:val="auto"/>
+        </w:rPr>
+        <w:t>gồm</w:t>
+      </w:r>
+      <w:r>
+        <w:rPr>
+          <w:color w:val="auto"/>
+        </w:rPr>
+        <w:t xml:space="preserve"> 141000 “null”, 9000 </w:t>
+      </w:r>
+      <w:r>
+        <w:rPr>
+          <w:color w:val="auto"/>
+        </w:rPr>
+        <w:t>dòng</w:t>
+      </w:r>
+      <w:r>
+        <w:rPr>
+          <w:color w:val="auto"/>
+        </w:rPr>
+        <w:t xml:space="preserve"> </w:t>
+      </w:r>
+      <w:r>
+        <w:rPr>
+          <w:color w:val="auto"/>
+        </w:rPr>
+        <w:t>có</w:t>
+      </w:r>
+      <w:r>
+        <w:rPr>
+          <w:color w:val="auto"/>
+        </w:rPr>
+        <w:t xml:space="preserve"> </w:t>
+      </w:r>
+      <w:r>
+        <w:rPr>
+          <w:color w:val="auto"/>
+        </w:rPr>
+        <w:t>dữ</w:t>
+      </w:r>
+      <w:r>
+        <w:rPr>
+          <w:color w:val="auto"/>
+        </w:rPr>
+        <w:t xml:space="preserve"> </w:t>
+      </w:r>
+      <w:r>
+        <w:rPr>
+          <w:color w:val="auto"/>
+        </w:rPr>
+        <w:t>liệu</w:t>
+      </w:r>
+      <w:r>
+        <w:rPr>
+          <w:color w:val="auto"/>
+        </w:rPr>
+        <w:t xml:space="preserve"> </w:t>
+      </w:r>
+      <w:r>
+        <w:rPr>
+          <w:color w:val="auto"/>
+        </w:rPr>
+        <w:t>thật</w:t>
+      </w:r>
+      <w:r>
+        <w:rPr>
+          <w:color w:val="auto"/>
+        </w:rPr>
+        <w:t xml:space="preserve"> (6%))</w:t>
+      </w:r>
+    </w:p>
+    <w:p>
+      <w:pPr>
+        <w:pStyle w:val="ListParagraph"/>
+        <w:numPr>
+          <w:ilvl w:val="1"/>
+          <w:numId w:val="2"/>
+        </w:numPr>
+        <w:rPr>
+          <w:color w:val="auto"/>
+        </w:rPr>
+      </w:pPr>
+      <w:r>
+        <w:rPr>
+          <w:color w:val="auto"/>
+        </w:rPr>
+        <w:t>Gồm</w:t>
+      </w:r>
+      <w:r>
+        <w:rPr>
+          <w:color w:val="auto"/>
+        </w:rPr>
+        <w:t xml:space="preserve"> 4 </w:t>
+      </w:r>
+      <w:r>
+        <w:rPr>
+          <w:color w:val="auto"/>
+        </w:rPr>
+        <w:t>giá</w:t>
+      </w:r>
+      <w:r>
+        <w:rPr>
+          <w:color w:val="auto"/>
+        </w:rPr>
+        <w:t xml:space="preserve"> </w:t>
+      </w:r>
+      <w:r>
+        <w:rPr>
+          <w:color w:val="auto"/>
+        </w:rPr>
+        <w:t>trị</w:t>
+      </w:r>
+      <w:r>
+        <w:rPr>
+          <w:color w:val="auto"/>
+        </w:rPr>
+        <w:t xml:space="preserve"> </w:t>
+      </w:r>
+      <w:r>
+        <w:rPr>
+          <w:color w:val="auto"/>
+        </w:rPr>
+        <w:t>duy</w:t>
+      </w:r>
+      <w:r>
+        <w:rPr>
+          <w:color w:val="auto"/>
+        </w:rPr>
+        <w:t xml:space="preserve"> </w:t>
+      </w:r>
+      <w:r>
+        <w:rPr>
+          <w:color w:val="auto"/>
+        </w:rPr>
+        <w:t>nhất</w:t>
+      </w:r>
+      <w:r>
+        <w:rPr>
+          <w:color w:val="auto"/>
+        </w:rPr>
+        <w:t xml:space="preserve">, </w:t>
+      </w:r>
+      <w:r>
+        <w:rPr>
+          <w:color w:val="auto"/>
+        </w:rPr>
+        <w:t>trong</w:t>
+      </w:r>
+      <w:r>
+        <w:rPr>
+          <w:color w:val="auto"/>
+        </w:rPr>
+        <w:t xml:space="preserve"> </w:t>
+      </w:r>
+      <w:r>
+        <w:rPr>
+          <w:color w:val="auto"/>
+        </w:rPr>
+        <w:t>đó</w:t>
+      </w:r>
+      <w:r>
+        <w:rPr>
+          <w:color w:val="auto"/>
+        </w:rPr>
+        <w:t xml:space="preserve"> “null” </w:t>
+      </w:r>
+      <w:r>
+        <w:rPr>
+          <w:color w:val="auto"/>
+        </w:rPr>
+        <w:t>cũng</w:t>
+      </w:r>
+      <w:r>
+        <w:rPr>
+          <w:color w:val="auto"/>
+        </w:rPr>
+        <w:t xml:space="preserve"> </w:t>
+      </w:r>
+      <w:r>
+        <w:rPr>
+          <w:color w:val="auto"/>
+        </w:rPr>
+        <w:t>được</w:t>
+      </w:r>
+      <w:r>
+        <w:rPr>
+          <w:color w:val="auto"/>
+        </w:rPr>
+        <w:t xml:space="preserve"> </w:t>
+      </w:r>
+      <w:r>
+        <w:rPr>
+          <w:color w:val="auto"/>
+        </w:rPr>
+        <w:t>coi</w:t>
+      </w:r>
+      <w:r>
+        <w:rPr>
+          <w:color w:val="auto"/>
+        </w:rPr>
+        <w:t xml:space="preserve"> </w:t>
+      </w:r>
+      <w:r>
+        <w:rPr>
+          <w:color w:val="auto"/>
+        </w:rPr>
+        <w:t>là</w:t>
+      </w:r>
+      <w:r>
+        <w:rPr>
+          <w:color w:val="auto"/>
+        </w:rPr>
+        <w:t xml:space="preserve"> </w:t>
+      </w:r>
+      <w:r>
+        <w:rPr>
+          <w:color w:val="auto"/>
+        </w:rPr>
+        <w:t>giá</w:t>
+      </w:r>
+      <w:r>
+        <w:rPr>
+          <w:color w:val="auto"/>
+        </w:rPr>
+        <w:t xml:space="preserve"> </w:t>
+      </w:r>
+      <w:r>
+        <w:rPr>
+          <w:color w:val="auto"/>
+        </w:rPr>
+        <w:t>trị</w:t>
+      </w:r>
+    </w:p>
+    <w:p>
+      <w:pPr>
+        <w:pStyle w:val="ListParagraph"/>
+        <w:numPr>
+          <w:ilvl w:val="1"/>
+          <w:numId w:val="2"/>
+        </w:numPr>
+        <w:rPr>
+          <w:color w:val="auto"/>
+        </w:rPr>
+      </w:pPr>
+      <w:r>
+        <w:rPr>
+          <w:color w:val="auto"/>
+        </w:rPr>
+        <w:t xml:space="preserve">Các </w:t>
+      </w:r>
+      <w:r>
+        <w:rPr>
+          <w:color w:val="auto"/>
+        </w:rPr>
+        <w:t>giá</w:t>
+      </w:r>
+      <w:r>
+        <w:rPr>
+          <w:color w:val="auto"/>
+        </w:rPr>
+        <w:t xml:space="preserve"> </w:t>
+      </w:r>
+      <w:r>
+        <w:rPr>
+          <w:color w:val="auto"/>
+        </w:rPr>
+        <w:t>trị</w:t>
+      </w:r>
+      <w:r>
+        <w:rPr>
+          <w:color w:val="auto"/>
+        </w:rPr>
+        <w:t>: Customer Demand</w:t>
+      </w:r>
+      <w:r>
+        <w:rPr>
+          <w:color w:val="auto"/>
+        </w:rPr>
+        <w:t xml:space="preserve"> (2.03%)</w:t>
+      </w:r>
+      <w:r>
+        <w:rPr>
+          <w:color w:val="auto"/>
+        </w:rPr>
+        <w:t>, Vehicle Breakdown</w:t>
+      </w:r>
+      <w:r>
+        <w:rPr>
+          <w:color w:val="auto"/>
+        </w:rPr>
+        <w:t xml:space="preserve"> (2.01%)</w:t>
+      </w:r>
+      <w:r>
+        <w:rPr>
+          <w:color w:val="auto"/>
+        </w:rPr>
+        <w:t>, Other Issue</w:t>
+      </w:r>
+      <w:r>
+        <w:rPr>
+          <w:color w:val="auto"/>
+        </w:rPr>
+        <w:t xml:space="preserve"> (1.97%)</w:t>
+      </w:r>
+      <w:r>
+        <w:rPr>
+          <w:color w:val="auto"/>
+        </w:rPr>
+        <w:t>, null</w:t>
+      </w:r>
+      <w:r>
+        <w:rPr>
+          <w:color w:val="auto"/>
+        </w:rPr>
+        <w:t xml:space="preserve"> (94%)</w:t>
+      </w:r>
+    </w:p>
+    <w:p>
+      <w:pPr>
+        <w:pStyle w:val="ListParagraph"/>
+        <w:numPr>
+          <w:ilvl w:val="1"/>
+          <w:numId w:val="2"/>
+        </w:numPr>
+        <w:rPr>
+          <w:color w:val="auto"/>
+        </w:rPr>
+      </w:pPr>
+      <w:r>
+        <w:rPr>
+          <w:i w:val="0"/>
+          <w:iCs w:val="0"/>
+          <w:color w:val="auto"/>
+          <w:u w:val="single"/>
+        </w:rPr>
+        <w:t>Issue</w:t>
+      </w:r>
+      <w:r>
+        <w:rPr>
+          <w:color w:val="auto"/>
+        </w:rPr>
+        <w:t xml:space="preserve">: “null” </w:t>
+      </w:r>
+      <w:r>
+        <w:rPr>
+          <w:color w:val="auto"/>
+        </w:rPr>
+        <w:t>được</w:t>
+      </w:r>
+      <w:r>
+        <w:rPr>
+          <w:color w:val="auto"/>
+        </w:rPr>
+        <w:t xml:space="preserve"> </w:t>
+      </w:r>
+      <w:r>
+        <w:rPr>
+          <w:color w:val="auto"/>
+        </w:rPr>
+        <w:t>coi</w:t>
+      </w:r>
+      <w:r>
+        <w:rPr>
+          <w:color w:val="auto"/>
+        </w:rPr>
+        <w:t xml:space="preserve"> </w:t>
+      </w:r>
+      <w:r>
+        <w:rPr>
+          <w:color w:val="auto"/>
+        </w:rPr>
+        <w:t>là</w:t>
+      </w:r>
+      <w:r>
+        <w:rPr>
+          <w:color w:val="auto"/>
+        </w:rPr>
+        <w:t xml:space="preserve"> giá trị hợp lệ</w:t>
+      </w:r>
+    </w:p>
+    <w:p>
+      <w:pPr>
+        <w:pStyle w:val="ListParagraph"/>
+        <w:numPr>
+          <w:ilvl w:val="0"/>
+          <w:numId w:val="2"/>
+        </w:numPr>
+        <w:rPr>
+          <w:color w:val="auto"/>
+        </w:rPr>
+      </w:pPr>
+      <w:r>
+        <w:rPr>
+          <w:color w:val="auto"/>
+        </w:rPr>
+        <w:t>Pickup Location</w:t>
+      </w:r>
+    </w:p>
+    <w:p>
+      <w:pPr>
+        <w:pStyle w:val="ListParagraph"/>
+        <w:numPr>
+          <w:ilvl w:val="1"/>
+          <w:numId w:val="2"/>
+        </w:numPr>
+        <w:rPr>
+          <w:color w:val="auto"/>
+        </w:rPr>
+      </w:pPr>
+      <w:r>
+        <w:rPr>
+          <w:color w:val="auto"/>
+        </w:rPr>
+        <w:t>150000 dòng có dữ liệu</w:t>
+      </w:r>
+    </w:p>
+    <w:p>
+      <w:pPr>
+        <w:pStyle w:val="ListParagraph"/>
+        <w:numPr>
+          <w:ilvl w:val="1"/>
+          <w:numId w:val="2"/>
+        </w:numPr>
+        <w:rPr>
+          <w:color w:val="auto"/>
+        </w:rPr>
+      </w:pPr>
+      <w:r>
+        <w:rPr>
+          <w:color w:val="auto"/>
+        </w:rPr>
+        <w:t>Gồm 176 giá trị duy nhất</w:t>
+      </w:r>
+    </w:p>
+    <w:p>
+      <w:pPr>
+        <w:pStyle w:val="ListParagraph"/>
+        <w:numPr>
+          <w:ilvl w:val="1"/>
+          <w:numId w:val="2"/>
+        </w:numPr>
+        <w:rPr>
+          <w:color w:val="auto"/>
+        </w:rPr>
+      </w:pPr>
+      <w:r>
+        <w:rPr>
+          <w:color w:val="auto"/>
+        </w:rPr>
+        <w:t>Top 3 Location:</w:t>
+      </w:r>
+    </w:p>
+    <w:p>
+      <w:pPr>
+        <w:pStyle w:val="ListParagraph"/>
+        <w:numPr>
+          <w:ilvl w:val="2"/>
+          <w:numId w:val="2"/>
+        </w:numPr>
+        <w:suppressLineNumbers w:val="0"/>
+        <w:bidi w:val="0"/>
+        <w:spacing w:before="0" w:beforeAutospacing="off" w:after="160" w:afterAutospacing="off" w:line="259" w:lineRule="auto"/>
+        <w:ind w:left="2880" w:right="0" w:hanging="360"/>
+        <w:jc w:val="left"/>
+        <w:rPr>
+          <w:noProof w:val="0"/>
+          <w:lang w:val="en-US"/>
+        </w:rPr>
+      </w:pPr>
+      <w:r>
+        <w:rPr>
+          <w:color w:val="auto"/>
+        </w:rPr>
+        <w:t>Ascending: G</w:t>
+      </w:r>
+      <w:r>
+        <w:rPr>
+          <w:color w:val="auto"/>
+        </w:rPr>
+        <w:t>hitorni</w:t>
+      </w:r>
+      <w:r>
+        <w:rPr>
+          <w:color w:val="auto"/>
+        </w:rPr>
+        <w:t xml:space="preserve"> Village (790), </w:t>
+      </w:r>
+      <w:r>
+        <w:rPr>
+          <w:noProof w:val="0"/>
+          <w:lang w:val="en-US"/>
+        </w:rPr>
+        <w:t>Ashok Vihar (796), Laxmi Nagar (797)</w:t>
+      </w:r>
+    </w:p>
+    <w:p>
+      <w:pPr>
+        <w:pStyle w:val="ListParagraph"/>
+        <w:numPr>
+          <w:ilvl w:val="2"/>
+          <w:numId w:val="2"/>
+        </w:numPr>
+        <w:rPr>
+          <w:noProof w:val="0"/>
+          <w:lang w:val="en-US"/>
+        </w:rPr>
+      </w:pPr>
+      <w:r>
+        <w:rPr>
+          <w:color w:val="auto"/>
+        </w:rPr>
+        <w:t xml:space="preserve">Descending: </w:t>
+      </w:r>
+      <w:r>
+        <w:rPr>
+          <w:color w:val="auto"/>
+        </w:rPr>
+        <w:t>Khandsa</w:t>
+      </w:r>
+      <w:r>
+        <w:rPr>
+          <w:color w:val="auto"/>
+        </w:rPr>
+        <w:t xml:space="preserve"> (949), </w:t>
+      </w:r>
+      <w:r>
+        <w:rPr>
+          <w:noProof w:val="0"/>
+          <w:lang w:val="en-US"/>
+        </w:rPr>
+        <w:t>Barakhamba</w:t>
+      </w:r>
+      <w:r>
+        <w:rPr>
+          <w:noProof w:val="0"/>
+          <w:lang w:val="en-US"/>
+        </w:rPr>
+        <w:t xml:space="preserve"> Road (946), Saket (931)</w:t>
+      </w:r>
+    </w:p>
+    <w:p>
+      <w:pPr>
+        <w:pStyle w:val="ListParagraph"/>
+        <w:numPr>
+          <w:ilvl w:val="2"/>
+          <w:numId w:val="2"/>
+        </w:numPr>
+        <w:rPr>
+          <w:noProof w:val="0"/>
+          <w:lang w:val="en-US"/>
+        </w:rPr>
+      </w:pPr>
+      <w:r>
+        <w:rPr>
+          <w:noProof w:val="0"/>
+          <w:lang w:val="en-US"/>
+        </w:rPr>
+        <w:t>Min: 790</w:t>
+      </w:r>
+    </w:p>
+    <w:p>
+      <w:pPr>
+        <w:pStyle w:val="ListParagraph"/>
+        <w:numPr>
+          <w:ilvl w:val="2"/>
+          <w:numId w:val="2"/>
+        </w:numPr>
+        <w:rPr>
+          <w:noProof w:val="0"/>
+          <w:lang w:val="en-US"/>
+        </w:rPr>
+      </w:pPr>
+      <w:r>
+        <w:rPr>
+          <w:noProof w:val="0"/>
+          <w:lang w:val="en-US"/>
+        </w:rPr>
+        <w:t>Max: 949</w:t>
+      </w:r>
+    </w:p>
+    <w:p>
+      <w:pPr>
+        <w:pStyle w:val="ListParagraph"/>
+        <w:numPr>
+          <w:ilvl w:val="2"/>
+          <w:numId w:val="2"/>
+        </w:numPr>
+        <w:rPr>
+          <w:noProof w:val="0"/>
+          <w:lang w:val="en-US"/>
+        </w:rPr>
+      </w:pPr>
+      <w:r>
+        <w:rPr>
+          <w:noProof w:val="0"/>
+          <w:lang w:val="en-US"/>
+        </w:rPr>
+        <w:t>Avg: 852.27</w:t>
+      </w:r>
+    </w:p>
+    <w:p>
+      <w:pPr>
+        <w:pStyle w:val="ListParagraph"/>
+        <w:numPr>
+          <w:ilvl w:val="0"/>
+          <w:numId w:val="2"/>
+        </w:numPr>
+        <w:rPr>
+          <w:noProof w:val="0"/>
+          <w:lang w:val="en-US"/>
+        </w:rPr>
+      </w:pPr>
+      <w:r>
+        <w:rPr>
+          <w:noProof w:val="0"/>
+          <w:lang w:val="en-US"/>
+        </w:rPr>
+        <w:t>Drop Location</w:t>
+      </w:r>
+    </w:p>
+    <w:p>
+      <w:pPr>
+        <w:pStyle w:val="ListParagraph"/>
+        <w:numPr>
+          <w:ilvl w:val="1"/>
+          <w:numId w:val="2"/>
+        </w:numPr>
+        <w:rPr>
+          <w:noProof w:val="0"/>
+          <w:lang w:val="en-US"/>
+        </w:rPr>
+      </w:pPr>
+      <w:r>
+        <w:rPr>
+          <w:noProof w:val="0"/>
+          <w:lang w:val="en-US"/>
+        </w:rPr>
+        <w:t xml:space="preserve">150000 </w:t>
+      </w:r>
+      <w:r>
+        <w:rPr>
+          <w:noProof w:val="0"/>
+          <w:lang w:val="en-US"/>
+        </w:rPr>
+        <w:t>dòng</w:t>
+      </w:r>
+      <w:r>
+        <w:rPr>
+          <w:noProof w:val="0"/>
+          <w:lang w:val="en-US"/>
+        </w:rPr>
+        <w:t xml:space="preserve"> có dữ liệu</w:t>
+      </w:r>
+    </w:p>
+    <w:p>
+      <w:pPr>
+        <w:pStyle w:val="ListParagraph"/>
+        <w:numPr>
+          <w:ilvl w:val="1"/>
+          <w:numId w:val="2"/>
+        </w:numPr>
+        <w:rPr>
+          <w:noProof w:val="0"/>
+          <w:lang w:val="en-US"/>
+        </w:rPr>
+      </w:pPr>
+      <w:r>
+        <w:rPr>
+          <w:noProof w:val="0"/>
+          <w:lang w:val="en-US"/>
+        </w:rPr>
+        <w:t>Gồm 176 giá trị duy nhất</w:t>
+      </w:r>
+    </w:p>
+    <w:p>
+      <w:pPr>
+        <w:pStyle w:val="ListParagraph"/>
+        <w:numPr>
+          <w:ilvl w:val="1"/>
+          <w:numId w:val="2"/>
+        </w:numPr>
+        <w:rPr>
+          <w:noProof w:val="0"/>
+          <w:lang w:val="en-US"/>
+        </w:rPr>
+      </w:pPr>
+      <w:r>
+        <w:rPr>
+          <w:noProof w:val="0"/>
+          <w:lang w:val="en-US"/>
+        </w:rPr>
+        <w:t>Top 3 Location:</w:t>
+      </w:r>
+    </w:p>
+    <w:p>
+      <w:pPr>
+        <w:pStyle w:val="ListParagraph"/>
+        <w:numPr>
+          <w:ilvl w:val="2"/>
+          <w:numId w:val="2"/>
+        </w:numPr>
+        <w:rPr>
+          <w:noProof w:val="0"/>
+          <w:lang w:val="en-US"/>
+        </w:rPr>
+      </w:pPr>
+      <w:r>
+        <w:rPr>
+          <w:noProof w:val="0"/>
+          <w:lang w:val="en-US"/>
+        </w:rPr>
+        <w:t>Ascending: Huda City Centre (774), Anand Vihar ISBT</w:t>
+      </w:r>
+      <w:r>
+        <w:rPr>
+          <w:noProof w:val="0"/>
+          <w:lang w:val="en-US"/>
+        </w:rPr>
+        <w:t xml:space="preserve"> (784), Shivaji Park (786)</w:t>
+      </w:r>
+    </w:p>
+    <w:p>
+      <w:pPr>
+        <w:pStyle w:val="ListParagraph"/>
+        <w:numPr>
+          <w:ilvl w:val="2"/>
+          <w:numId w:val="2"/>
+        </w:numPr>
+        <w:rPr>
+          <w:noProof w:val="0"/>
+          <w:lang w:val="en-US"/>
+        </w:rPr>
+      </w:pPr>
+      <w:r>
+        <w:rPr>
+          <w:noProof w:val="0"/>
+          <w:lang w:val="en-US"/>
+        </w:rPr>
+        <w:t>Descending:</w:t>
+      </w:r>
+      <w:r>
+        <w:rPr>
+          <w:noProof w:val="0"/>
+          <w:lang w:val="en-US"/>
+        </w:rPr>
+        <w:t xml:space="preserve"> Ashram (936), </w:t>
+      </w:r>
+      <w:r>
+        <w:rPr>
+          <w:noProof w:val="0"/>
+          <w:lang w:val="en-US"/>
+        </w:rPr>
+        <w:t>Basai</w:t>
+      </w:r>
+      <w:r>
+        <w:rPr>
+          <w:noProof w:val="0"/>
+          <w:lang w:val="en-US"/>
+        </w:rPr>
+        <w:t xml:space="preserve"> </w:t>
+      </w:r>
+      <w:r>
+        <w:rPr>
+          <w:noProof w:val="0"/>
+          <w:lang w:val="en-US"/>
+        </w:rPr>
+        <w:t>Dhankot</w:t>
+      </w:r>
+      <w:r>
+        <w:rPr>
+          <w:noProof w:val="0"/>
+          <w:lang w:val="en-US"/>
+        </w:rPr>
+        <w:t xml:space="preserve"> (917), Lok Kalyan Marg (916)</w:t>
+      </w:r>
+    </w:p>
+    <w:p>
+      <w:pPr>
+        <w:pStyle w:val="ListParagraph"/>
+        <w:numPr>
+          <w:ilvl w:val="2"/>
+          <w:numId w:val="2"/>
+        </w:numPr>
+        <w:rPr>
+          <w:noProof w:val="0"/>
+          <w:lang w:val="en-US"/>
+        </w:rPr>
+      </w:pPr>
+      <w:r>
+        <w:rPr>
+          <w:noProof w:val="0"/>
+          <w:lang w:val="en-US"/>
+        </w:rPr>
+        <w:t>Min: 774</w:t>
+      </w:r>
+    </w:p>
+    <w:p>
+      <w:pPr>
+        <w:pStyle w:val="ListParagraph"/>
+        <w:numPr>
+          <w:ilvl w:val="2"/>
+          <w:numId w:val="2"/>
+        </w:numPr>
+        <w:rPr>
+          <w:noProof w:val="0"/>
+          <w:lang w:val="en-US"/>
+        </w:rPr>
+      </w:pPr>
+      <w:r>
+        <w:rPr>
+          <w:noProof w:val="0"/>
+          <w:lang w:val="en-US"/>
+        </w:rPr>
+        <w:t>Max: 936</w:t>
+      </w:r>
+    </w:p>
+    <w:p>
+      <w:pPr>
+        <w:pStyle w:val="ListParagraph"/>
+        <w:numPr>
+          <w:ilvl w:val="2"/>
+          <w:numId w:val="2"/>
+        </w:numPr>
+        <w:rPr>
+          <w:noProof w:val="0"/>
+          <w:lang w:val="en-US"/>
+        </w:rPr>
+      </w:pPr>
+      <w:r>
+        <w:rPr>
+          <w:noProof w:val="0"/>
+          <w:lang w:val="en-US"/>
+        </w:rPr>
+        <w:t>Avg: 852.27</w:t>
+      </w:r>
+    </w:p>
+    <w:p>
+      <w:pPr>
+        <w:pStyle w:val="ListParagraph"/>
+        <w:numPr>
+          <w:ilvl w:val="0"/>
+          <w:numId w:val="2"/>
+        </w:numPr>
+        <w:rPr>
+          <w:noProof w:val="0"/>
+          <w:lang w:val="en-US"/>
+        </w:rPr>
+      </w:pPr>
+      <w:r>
+        <w:rPr>
+          <w:noProof w:val="0"/>
+          <w:lang w:val="en-US"/>
+        </w:rPr>
+        <w:t>Driver Ratings</w:t>
+      </w:r>
+    </w:p>
+    <w:p>
+      <w:pPr>
+        <w:pStyle w:val="ListParagraph"/>
+        <w:numPr>
+          <w:ilvl w:val="1"/>
+          <w:numId w:val="2"/>
+        </w:numPr>
+        <w:rPr>
+          <w:noProof w:val="0"/>
+          <w:lang w:val="en-US"/>
+        </w:rPr>
+      </w:pPr>
+      <w:r>
+        <w:rPr>
+          <w:noProof w:val="0"/>
+          <w:lang w:val="en-US"/>
+        </w:rPr>
+        <w:t xml:space="preserve">93000 </w:t>
+      </w:r>
+      <w:r>
+        <w:rPr>
+          <w:noProof w:val="0"/>
+          <w:lang w:val="en-US"/>
+        </w:rPr>
+        <w:t>dòng</w:t>
+      </w:r>
+      <w:r>
+        <w:rPr>
+          <w:noProof w:val="0"/>
+          <w:lang w:val="en-US"/>
+        </w:rPr>
+        <w:t xml:space="preserve"> </w:t>
+      </w:r>
+      <w:r>
+        <w:rPr>
+          <w:noProof w:val="0"/>
+          <w:lang w:val="en-US"/>
+        </w:rPr>
+        <w:t>có</w:t>
+      </w:r>
+      <w:r>
+        <w:rPr>
+          <w:noProof w:val="0"/>
+          <w:lang w:val="en-US"/>
+        </w:rPr>
+        <w:t xml:space="preserve"> </w:t>
+      </w:r>
+      <w:r>
+        <w:rPr>
+          <w:noProof w:val="0"/>
+          <w:lang w:val="en-US"/>
+        </w:rPr>
+        <w:t>dữ</w:t>
+      </w:r>
+      <w:r>
+        <w:rPr>
+          <w:noProof w:val="0"/>
+          <w:lang w:val="en-US"/>
+        </w:rPr>
+        <w:t xml:space="preserve"> liệu</w:t>
+      </w:r>
+      <w:r>
+        <w:rPr>
+          <w:noProof w:val="0"/>
+          <w:lang w:val="en-US"/>
+        </w:rPr>
+        <w:t xml:space="preserve"> (62%)</w:t>
+      </w:r>
+    </w:p>
+    <w:p>
+      <w:pPr>
+        <w:pStyle w:val="ListParagraph"/>
+        <w:numPr>
+          <w:ilvl w:val="1"/>
+          <w:numId w:val="2"/>
+        </w:numPr>
+        <w:rPr>
+          <w:noProof w:val="0"/>
+          <w:lang w:val="en-US"/>
+        </w:rPr>
+      </w:pPr>
+      <w:r>
+        <w:rPr>
+          <w:noProof w:val="0"/>
+          <w:lang w:val="en-US"/>
+        </w:rPr>
+        <w:t>Min: 3</w:t>
+      </w:r>
+    </w:p>
+    <w:p>
+      <w:pPr>
+        <w:pStyle w:val="ListParagraph"/>
+        <w:numPr>
+          <w:ilvl w:val="1"/>
+          <w:numId w:val="2"/>
+        </w:numPr>
+        <w:rPr>
+          <w:noProof w:val="0"/>
+          <w:lang w:val="en-US"/>
+        </w:rPr>
+      </w:pPr>
+      <w:r>
+        <w:rPr>
+          <w:noProof w:val="0"/>
+          <w:lang w:val="en-US"/>
+        </w:rPr>
+        <w:t>Max: 5</w:t>
+      </w:r>
+    </w:p>
+    <w:p>
+      <w:pPr>
+        <w:pStyle w:val="ListParagraph"/>
+        <w:numPr>
+          <w:ilvl w:val="1"/>
+          <w:numId w:val="2"/>
+        </w:numPr>
+        <w:rPr>
+          <w:noProof w:val="0"/>
+          <w:lang w:val="en-US"/>
+        </w:rPr>
+      </w:pPr>
+      <w:r>
+        <w:rPr>
+          <w:noProof w:val="0"/>
+          <w:lang w:val="en-US"/>
+        </w:rPr>
+        <w:t>Avg: 4.231</w:t>
+      </w:r>
+    </w:p>
+    <w:p>
+      <w:pPr>
+        <w:pStyle w:val="ListParagraph"/>
+        <w:numPr>
+          <w:ilvl w:val="1"/>
+          <w:numId w:val="2"/>
+        </w:numPr>
+        <w:rPr>
+          <w:noProof w:val="0"/>
+          <w:lang w:val="en-US"/>
+        </w:rPr>
+      </w:pPr>
+      <w:r>
+        <w:rPr>
+          <w:noProof w:val="0"/>
+          <w:lang w:val="en-US"/>
+        </w:rPr>
+        <w:t>Standard deviation: 0.434</w:t>
+      </w:r>
+    </w:p>
+    <w:p>
+      <w:pPr>
+        <w:pStyle w:val="ListParagraph"/>
+        <w:numPr>
+          <w:ilvl w:val="0"/>
+          <w:numId w:val="2"/>
+        </w:numPr>
+        <w:rPr>
+          <w:noProof w:val="0"/>
+          <w:lang w:val="en-US"/>
+        </w:rPr>
+      </w:pPr>
+      <w:r>
+        <w:rPr>
+          <w:noProof w:val="0"/>
+          <w:lang w:val="en-US"/>
+        </w:rPr>
+        <w:t>Customer Ratings</w:t>
+      </w:r>
+    </w:p>
+    <w:p>
+      <w:pPr>
+        <w:pStyle w:val="ListParagraph"/>
+        <w:numPr>
+          <w:ilvl w:val="1"/>
+          <w:numId w:val="2"/>
+        </w:numPr>
+        <w:rPr>
+          <w:noProof w:val="0"/>
+          <w:lang w:val="en-US"/>
+        </w:rPr>
+      </w:pPr>
+      <w:r>
+        <w:rPr>
+          <w:noProof w:val="0"/>
+          <w:lang w:val="en-US"/>
+        </w:rPr>
+        <w:t xml:space="preserve">93000 </w:t>
+      </w:r>
+      <w:r>
+        <w:rPr>
+          <w:noProof w:val="0"/>
+          <w:lang w:val="en-US"/>
+        </w:rPr>
+        <w:t>dòng</w:t>
+      </w:r>
+      <w:r>
+        <w:rPr>
+          <w:noProof w:val="0"/>
+          <w:lang w:val="en-US"/>
+        </w:rPr>
+        <w:t xml:space="preserve"> </w:t>
+      </w:r>
+      <w:r>
+        <w:rPr>
+          <w:noProof w:val="0"/>
+          <w:lang w:val="en-US"/>
+        </w:rPr>
+        <w:t>có</w:t>
+      </w:r>
+      <w:r>
+        <w:rPr>
+          <w:noProof w:val="0"/>
+          <w:lang w:val="en-US"/>
+        </w:rPr>
+        <w:t xml:space="preserve"> </w:t>
+      </w:r>
+      <w:r>
+        <w:rPr>
+          <w:noProof w:val="0"/>
+          <w:lang w:val="en-US"/>
+        </w:rPr>
+        <w:t>dữ</w:t>
+      </w:r>
+      <w:r>
+        <w:rPr>
+          <w:noProof w:val="0"/>
+          <w:lang w:val="en-US"/>
+        </w:rPr>
+        <w:t xml:space="preserve"> </w:t>
+      </w:r>
+      <w:r>
+        <w:rPr>
+          <w:noProof w:val="0"/>
+          <w:lang w:val="en-US"/>
+        </w:rPr>
+        <w:t>liệu</w:t>
+      </w:r>
+      <w:r>
+        <w:rPr>
+          <w:noProof w:val="0"/>
+          <w:lang w:val="en-US"/>
+        </w:rPr>
+        <w:t xml:space="preserve"> (62%)</w:t>
+      </w:r>
+    </w:p>
+    <w:p>
+      <w:pPr>
+        <w:pStyle w:val="ListParagraph"/>
+        <w:numPr>
+          <w:ilvl w:val="1"/>
+          <w:numId w:val="2"/>
+        </w:numPr>
+        <w:rPr>
+          <w:noProof w:val="0"/>
+          <w:lang w:val="en-US"/>
+        </w:rPr>
+      </w:pPr>
+      <w:r>
+        <w:rPr>
+          <w:noProof w:val="0"/>
+          <w:lang w:val="en-US"/>
+        </w:rPr>
+        <w:t>Min: 3</w:t>
+      </w:r>
+    </w:p>
+    <w:p>
+      <w:pPr>
+        <w:pStyle w:val="ListParagraph"/>
+        <w:numPr>
+          <w:ilvl w:val="1"/>
+          <w:numId w:val="2"/>
+        </w:numPr>
+        <w:rPr>
+          <w:noProof w:val="0"/>
+          <w:lang w:val="en-US"/>
+        </w:rPr>
+      </w:pPr>
+      <w:r>
+        <w:rPr>
+          <w:noProof w:val="0"/>
+          <w:lang w:val="en-US"/>
+        </w:rPr>
+        <w:t>Max: 5</w:t>
+      </w:r>
+    </w:p>
+    <w:p>
+      <w:pPr>
+        <w:pStyle w:val="ListParagraph"/>
+        <w:numPr>
+          <w:ilvl w:val="1"/>
+          <w:numId w:val="2"/>
+        </w:numPr>
+        <w:rPr>
+          <w:noProof w:val="0"/>
+          <w:lang w:val="en-US"/>
+        </w:rPr>
+      </w:pPr>
+      <w:r>
+        <w:rPr>
+          <w:noProof w:val="0"/>
+          <w:lang w:val="en-US"/>
+        </w:rPr>
+        <w:t>Avg: 4.405</w:t>
+      </w:r>
+    </w:p>
+    <w:p>
+      <w:pPr>
+        <w:pStyle w:val="ListParagraph"/>
+        <w:numPr>
+          <w:ilvl w:val="1"/>
+          <w:numId w:val="2"/>
+        </w:numPr>
+        <w:rPr>
+          <w:noProof w:val="0"/>
+          <w:lang w:val="en-US"/>
+        </w:rPr>
+      </w:pPr>
+      <w:r>
+        <w:rPr>
+          <w:noProof w:val="0"/>
+          <w:lang w:val="en-US"/>
+        </w:rPr>
+        <w:t>Standard deviation: 0.438</w:t>
+      </w:r>
+    </w:p>
+    <w:p xmlns:wp14="http://schemas.microsoft.com/office/word/2010/wordml" wp14:textId="77777777">
+      <w:pPr>
         <w:ind w:left="1440"/>
       </w:pPr>
     </w:p>
-    <w:p/>
+    <w:p xmlns:wp14="http://schemas.microsoft.com/office/word/2010/wordml" wp14:textId="77777777"/>
     <w:sectPr>
-      <w:pgSz w:w="12240" w:h="15840"/>
+      <w:pgSz w:w="12240" w:h="15840" w:orient="portrait"/>
       <w:pgMar w:top="1440" w:right="1440" w:bottom="1440" w:left="1440" w:header="720" w:footer="720" w:gutter="0"/>
       <w:cols w:space="720"/>
       <w:docGrid w:linePitch="360"/>
@@ -1180,6 +3732,261 @@
 
 <file path=word/numbering.xml><?xml version="1.0" encoding="utf-8"?>
 <w:numbering xmlns:wpc="http://schemas.microsoft.com/office/word/2010/wordprocessingCanvas" xmlns:cx="http://schemas.microsoft.com/office/drawing/2014/chartex" xmlns:mc="http://schemas.openxmlformats.org/markup-compatibility/2006" xmlns:o="urn:schemas-microsoft-com:office:office" xmlns:r="http://schemas.openxmlformats.org/officeDocument/2006/relationships" xmlns:m="http://schemas.openxmlformats.org/officeDocument/2006/math" xmlns:v="urn:schemas-microsoft-com:vml" xmlns:wp14="http://schemas.microsoft.com/office/word/2010/wordprocessingDrawing" xmlns:wp="http://schemas.openxmlformats.org/drawingml/2006/wordprocessingDrawing" xmlns:w10="urn:schemas-microsoft-com:office:word" xmlns:w="http://schemas.openxmlformats.org/wordprocessingml/2006/main" xmlns:w14="http://schemas.microsoft.com/office/word/2010/wordml" xmlns:w15="http://schemas.microsoft.com/office/word/2012/wordml" xmlns:w16se="http://schemas.microsoft.com/office/word/2015/wordml/symex" xmlns:wpg="http://schemas.microsoft.com/office/word/2010/wordprocessingGroup" xmlns:wpi="http://schemas.microsoft.com/office/word/2010/wordprocessingInk" xmlns:wne="http://schemas.microsoft.com/office/word/2006/wordml" xmlns:wps="http://schemas.microsoft.com/office/word/2010/wordprocessingShape" mc:Ignorable="w14 w15 w16se wp14">
+  <w:abstractNum xmlns:w="http://schemas.openxmlformats.org/wordprocessingml/2006/main" w:abstractNumId="5">
+    <w:nsid w:val="3187358f"/>
+    <w:multiLevelType xmlns:w="http://schemas.openxmlformats.org/wordprocessingml/2006/main" w:val="hybridMultilevel"/>
+    <w:lvl xmlns:w="http://schemas.openxmlformats.org/wordprocessingml/2006/main" w:ilvl="0">
+      <w:start w:val="1"/>
+      <w:numFmt w:val="upperRoman"/>
+      <w:lvlText w:val="%1."/>
+      <w:lvlJc w:val="right"/>
+      <w:pPr>
+        <w:ind w:left="720" w:hanging="360"/>
+      </w:pPr>
+    </w:lvl>
+    <w:lvl xmlns:w="http://schemas.openxmlformats.org/wordprocessingml/2006/main" w:ilvl="1">
+      <w:start w:val="1"/>
+      <w:numFmt w:val="lowerLetter"/>
+      <w:lvlText w:val="%2."/>
+      <w:lvlJc w:val="left"/>
+      <w:pPr>
+        <w:ind w:left="1440" w:hanging="360"/>
+      </w:pPr>
+    </w:lvl>
+    <w:lvl xmlns:w="http://schemas.openxmlformats.org/wordprocessingml/2006/main" w:ilvl="2">
+      <w:start w:val="1"/>
+      <w:numFmt w:val="lowerRoman"/>
+      <w:lvlText w:val="%3."/>
+      <w:lvlJc w:val="right"/>
+      <w:pPr>
+        <w:ind w:left="2160" w:hanging="180"/>
+      </w:pPr>
+    </w:lvl>
+    <w:lvl xmlns:w="http://schemas.openxmlformats.org/wordprocessingml/2006/main" w:ilvl="3">
+      <w:start w:val="1"/>
+      <w:numFmt w:val="decimal"/>
+      <w:lvlText w:val="%4."/>
+      <w:lvlJc w:val="left"/>
+      <w:pPr>
+        <w:ind w:left="2880" w:hanging="360"/>
+      </w:pPr>
+    </w:lvl>
+    <w:lvl xmlns:w="http://schemas.openxmlformats.org/wordprocessingml/2006/main" w:ilvl="4">
+      <w:start w:val="1"/>
+      <w:numFmt w:val="lowerLetter"/>
+      <w:lvlText w:val="%5."/>
+      <w:lvlJc w:val="left"/>
+      <w:pPr>
+        <w:ind w:left="3600" w:hanging="360"/>
+      </w:pPr>
+    </w:lvl>
+    <w:lvl xmlns:w="http://schemas.openxmlformats.org/wordprocessingml/2006/main" w:ilvl="5">
+      <w:start w:val="1"/>
+      <w:numFmt w:val="lowerRoman"/>
+      <w:lvlText w:val="%6."/>
+      <w:lvlJc w:val="right"/>
+      <w:pPr>
+        <w:ind w:left="4320" w:hanging="180"/>
+      </w:pPr>
+    </w:lvl>
+    <w:lvl xmlns:w="http://schemas.openxmlformats.org/wordprocessingml/2006/main" w:ilvl="6">
+      <w:start w:val="1"/>
+      <w:numFmt w:val="decimal"/>
+      <w:lvlText w:val="%7."/>
+      <w:lvlJc w:val="left"/>
+      <w:pPr>
+        <w:ind w:left="5040" w:hanging="360"/>
+      </w:pPr>
+    </w:lvl>
+    <w:lvl xmlns:w="http://schemas.openxmlformats.org/wordprocessingml/2006/main" w:ilvl="7">
+      <w:start w:val="1"/>
+      <w:numFmt w:val="lowerLetter"/>
+      <w:lvlText w:val="%8."/>
+      <w:lvlJc w:val="left"/>
+      <w:pPr>
+        <w:ind w:left="5760" w:hanging="360"/>
+      </w:pPr>
+    </w:lvl>
+    <w:lvl xmlns:w="http://schemas.openxmlformats.org/wordprocessingml/2006/main" w:ilvl="8">
+      <w:start w:val="1"/>
+      <w:numFmt w:val="lowerRoman"/>
+      <w:lvlText w:val="%9."/>
+      <w:lvlJc w:val="right"/>
+      <w:pPr>
+        <w:ind w:left="6480" w:hanging="180"/>
+      </w:pPr>
+    </w:lvl>
+  </w:abstractNum>
+  <w:abstractNum xmlns:w="http://schemas.openxmlformats.org/wordprocessingml/2006/main" w:abstractNumId="4">
+    <w:nsid w:val="70371160"/>
+    <w:multiLevelType xmlns:w="http://schemas.openxmlformats.org/wordprocessingml/2006/main" w:val="hybridMultilevel"/>
+    <w:lvl xmlns:w="http://schemas.openxmlformats.org/wordprocessingml/2006/main" w:ilvl="0">
+      <w:start w:val="1"/>
+      <w:numFmt w:val="upperRoman"/>
+      <w:lvlText w:val="%1."/>
+      <w:lvlJc w:val="right"/>
+      <w:pPr>
+        <w:ind w:left="720" w:hanging="360"/>
+      </w:pPr>
+    </w:lvl>
+    <w:lvl xmlns:w="http://schemas.openxmlformats.org/wordprocessingml/2006/main" w:ilvl="1">
+      <w:start w:val="1"/>
+      <w:numFmt w:val="lowerLetter"/>
+      <w:lvlText w:val="%2."/>
+      <w:lvlJc w:val="left"/>
+      <w:pPr>
+        <w:ind w:left="1440" w:hanging="360"/>
+      </w:pPr>
+    </w:lvl>
+    <w:lvl xmlns:w="http://schemas.openxmlformats.org/wordprocessingml/2006/main" w:ilvl="2">
+      <w:start w:val="1"/>
+      <w:numFmt w:val="lowerRoman"/>
+      <w:lvlText w:val="%3."/>
+      <w:lvlJc w:val="right"/>
+      <w:pPr>
+        <w:ind w:left="2160" w:hanging="180"/>
+      </w:pPr>
+    </w:lvl>
+    <w:lvl xmlns:w="http://schemas.openxmlformats.org/wordprocessingml/2006/main" w:ilvl="3">
+      <w:start w:val="1"/>
+      <w:numFmt w:val="decimal"/>
+      <w:lvlText w:val="%4."/>
+      <w:lvlJc w:val="left"/>
+      <w:pPr>
+        <w:ind w:left="2880" w:hanging="360"/>
+      </w:pPr>
+    </w:lvl>
+    <w:lvl xmlns:w="http://schemas.openxmlformats.org/wordprocessingml/2006/main" w:ilvl="4">
+      <w:start w:val="1"/>
+      <w:numFmt w:val="lowerLetter"/>
+      <w:lvlText w:val="%5."/>
+      <w:lvlJc w:val="left"/>
+      <w:pPr>
+        <w:ind w:left="3600" w:hanging="360"/>
+      </w:pPr>
+    </w:lvl>
+    <w:lvl xmlns:w="http://schemas.openxmlformats.org/wordprocessingml/2006/main" w:ilvl="5">
+      <w:start w:val="1"/>
+      <w:numFmt w:val="lowerRoman"/>
+      <w:lvlText w:val="%6."/>
+      <w:lvlJc w:val="right"/>
+      <w:pPr>
+        <w:ind w:left="4320" w:hanging="180"/>
+      </w:pPr>
+    </w:lvl>
+    <w:lvl xmlns:w="http://schemas.openxmlformats.org/wordprocessingml/2006/main" w:ilvl="6">
+      <w:start w:val="1"/>
+      <w:numFmt w:val="decimal"/>
+      <w:lvlText w:val="%7."/>
+      <w:lvlJc w:val="left"/>
+      <w:pPr>
+        <w:ind w:left="5040" w:hanging="360"/>
+      </w:pPr>
+    </w:lvl>
+    <w:lvl xmlns:w="http://schemas.openxmlformats.org/wordprocessingml/2006/main" w:ilvl="7">
+      <w:start w:val="1"/>
+      <w:numFmt w:val="lowerLetter"/>
+      <w:lvlText w:val="%8."/>
+      <w:lvlJc w:val="left"/>
+      <w:pPr>
+        <w:ind w:left="5760" w:hanging="360"/>
+      </w:pPr>
+    </w:lvl>
+    <w:lvl xmlns:w="http://schemas.openxmlformats.org/wordprocessingml/2006/main" w:ilvl="8">
+      <w:start w:val="1"/>
+      <w:numFmt w:val="lowerRoman"/>
+      <w:lvlText w:val="%9."/>
+      <w:lvlJc w:val="right"/>
+      <w:pPr>
+        <w:ind w:left="6480" w:hanging="180"/>
+      </w:pPr>
+    </w:lvl>
+  </w:abstractNum>
+  <w:abstractNum xmlns:w="http://schemas.openxmlformats.org/wordprocessingml/2006/main" w:abstractNumId="3">
+    <w:nsid w:val="70b80454"/>
+    <w:multiLevelType xmlns:w="http://schemas.openxmlformats.org/wordprocessingml/2006/main" w:val="hybridMultilevel"/>
+    <w:lvl xmlns:w="http://schemas.openxmlformats.org/wordprocessingml/2006/main" w:ilvl="0">
+      <w:start w:val="1"/>
+      <w:numFmt w:val="upperRoman"/>
+      <w:lvlText w:val="%1."/>
+      <w:lvlJc w:val="right"/>
+      <w:pPr>
+        <w:ind w:left="720" w:hanging="360"/>
+      </w:pPr>
+    </w:lvl>
+    <w:lvl xmlns:w="http://schemas.openxmlformats.org/wordprocessingml/2006/main" w:ilvl="1">
+      <w:start w:val="1"/>
+      <w:numFmt w:val="lowerLetter"/>
+      <w:lvlText w:val="%2."/>
+      <w:lvlJc w:val="left"/>
+      <w:pPr>
+        <w:ind w:left="1440" w:hanging="360"/>
+      </w:pPr>
+    </w:lvl>
+    <w:lvl xmlns:w="http://schemas.openxmlformats.org/wordprocessingml/2006/main" w:ilvl="2">
+      <w:start w:val="1"/>
+      <w:numFmt w:val="lowerRoman"/>
+      <w:lvlText w:val="%3."/>
+      <w:lvlJc w:val="right"/>
+      <w:pPr>
+        <w:ind w:left="2160" w:hanging="180"/>
+      </w:pPr>
+    </w:lvl>
+    <w:lvl xmlns:w="http://schemas.openxmlformats.org/wordprocessingml/2006/main" w:ilvl="3">
+      <w:start w:val="1"/>
+      <w:numFmt w:val="decimal"/>
+      <w:lvlText w:val="%4."/>
+      <w:lvlJc w:val="left"/>
+      <w:pPr>
+        <w:ind w:left="2880" w:hanging="360"/>
+      </w:pPr>
+    </w:lvl>
+    <w:lvl xmlns:w="http://schemas.openxmlformats.org/wordprocessingml/2006/main" w:ilvl="4">
+      <w:start w:val="1"/>
+      <w:numFmt w:val="lowerLetter"/>
+      <w:lvlText w:val="%5."/>
+      <w:lvlJc w:val="left"/>
+      <w:pPr>
+        <w:ind w:left="3600" w:hanging="360"/>
+      </w:pPr>
+    </w:lvl>
+    <w:lvl xmlns:w="http://schemas.openxmlformats.org/wordprocessingml/2006/main" w:ilvl="5">
+      <w:start w:val="1"/>
+      <w:numFmt w:val="lowerRoman"/>
+      <w:lvlText w:val="%6."/>
+      <w:lvlJc w:val="right"/>
+      <w:pPr>
+        <w:ind w:left="4320" w:hanging="180"/>
+      </w:pPr>
+    </w:lvl>
+    <w:lvl xmlns:w="http://schemas.openxmlformats.org/wordprocessingml/2006/main" w:ilvl="6">
+      <w:start w:val="1"/>
+      <w:numFmt w:val="decimal"/>
+      <w:lvlText w:val="%7."/>
+      <w:lvlJc w:val="left"/>
+      <w:pPr>
+        <w:ind w:left="5040" w:hanging="360"/>
+      </w:pPr>
+    </w:lvl>
+    <w:lvl xmlns:w="http://schemas.openxmlformats.org/wordprocessingml/2006/main" w:ilvl="7">
+      <w:start w:val="1"/>
+      <w:numFmt w:val="lowerLetter"/>
+      <w:lvlText w:val="%8."/>
+      <w:lvlJc w:val="left"/>
+      <w:pPr>
+        <w:ind w:left="5760" w:hanging="360"/>
+      </w:pPr>
+    </w:lvl>
+    <w:lvl xmlns:w="http://schemas.openxmlformats.org/wordprocessingml/2006/main" w:ilvl="8">
+      <w:start w:val="1"/>
+      <w:numFmt w:val="lowerRoman"/>
+      <w:lvlText w:val="%9."/>
+      <w:lvlJc w:val="right"/>
+      <w:pPr>
+        <w:ind w:left="6480" w:hanging="180"/>
+      </w:pPr>
+    </w:lvl>
+  </w:abstractNum>
   <w:abstractNum w:abstractNumId="0" w15:restartNumberingAfterBreak="0">
     <w:nsid w:val="03D06633"/>
     <w:multiLevelType w:val="hybridMultilevel"/>
@@ -1371,7 +4178,7 @@
         <w:ind w:left="1440" w:hanging="360"/>
       </w:pPr>
       <w:rPr>
-        <w:rFonts w:ascii="Calibri" w:eastAsiaTheme="minorHAnsi" w:hAnsi="Calibri" w:cs="Calibri" w:hint="default"/>
+        <w:rFonts w:hint="default" w:ascii="Calibri" w:hAnsi="Calibri" w:cs="Calibri" w:eastAsiaTheme="minorHAnsi"/>
       </w:rPr>
     </w:lvl>
     <w:lvl w:ilvl="1" w:tplc="04090003">
@@ -1383,7 +4190,7 @@
         <w:ind w:left="2160" w:hanging="360"/>
       </w:pPr>
       <w:rPr>
-        <w:rFonts w:ascii="Courier New" w:hAnsi="Courier New" w:cs="Courier New" w:hint="default"/>
+        <w:rFonts w:hint="default" w:ascii="Courier New" w:hAnsi="Courier New" w:cs="Courier New"/>
       </w:rPr>
     </w:lvl>
     <w:lvl w:ilvl="2" w:tplc="04090005" w:tentative="1">
@@ -1395,7 +4202,7 @@
         <w:ind w:left="2880" w:hanging="360"/>
       </w:pPr>
       <w:rPr>
-        <w:rFonts w:ascii="Wingdings" w:hAnsi="Wingdings" w:hint="default"/>
+        <w:rFonts w:hint="default" w:ascii="Wingdings" w:hAnsi="Wingdings"/>
       </w:rPr>
     </w:lvl>
     <w:lvl w:ilvl="3" w:tplc="04090001" w:tentative="1">
@@ -1407,7 +4214,7 @@
         <w:ind w:left="3600" w:hanging="360"/>
       </w:pPr>
       <w:rPr>
-        <w:rFonts w:ascii="Symbol" w:hAnsi="Symbol" w:hint="default"/>
+        <w:rFonts w:hint="default" w:ascii="Symbol" w:hAnsi="Symbol"/>
       </w:rPr>
     </w:lvl>
     <w:lvl w:ilvl="4" w:tplc="04090003" w:tentative="1">
@@ -1419,7 +4226,7 @@
         <w:ind w:left="4320" w:hanging="360"/>
       </w:pPr>
       <w:rPr>
-        <w:rFonts w:ascii="Courier New" w:hAnsi="Courier New" w:cs="Courier New" w:hint="default"/>
+        <w:rFonts w:hint="default" w:ascii="Courier New" w:hAnsi="Courier New" w:cs="Courier New"/>
       </w:rPr>
     </w:lvl>
     <w:lvl w:ilvl="5" w:tplc="04090005" w:tentative="1">
@@ -1431,7 +4238,7 @@
         <w:ind w:left="5040" w:hanging="360"/>
       </w:pPr>
       <w:rPr>
-        <w:rFonts w:ascii="Wingdings" w:hAnsi="Wingdings" w:hint="default"/>
+        <w:rFonts w:hint="default" w:ascii="Wingdings" w:hAnsi="Wingdings"/>
       </w:rPr>
     </w:lvl>
     <w:lvl w:ilvl="6" w:tplc="04090001" w:tentative="1">
@@ -1443,7 +4250,7 @@
         <w:ind w:left="5760" w:hanging="360"/>
       </w:pPr>
       <w:rPr>
-        <w:rFonts w:ascii="Symbol" w:hAnsi="Symbol" w:hint="default"/>
+        <w:rFonts w:hint="default" w:ascii="Symbol" w:hAnsi="Symbol"/>
       </w:rPr>
     </w:lvl>
     <w:lvl w:ilvl="7" w:tplc="04090003" w:tentative="1">
@@ -1455,7 +4262,7 @@
         <w:ind w:left="6480" w:hanging="360"/>
       </w:pPr>
       <w:rPr>
-        <w:rFonts w:ascii="Courier New" w:hAnsi="Courier New" w:cs="Courier New" w:hint="default"/>
+        <w:rFonts w:hint="default" w:ascii="Courier New" w:hAnsi="Courier New" w:cs="Courier New"/>
       </w:rPr>
     </w:lvl>
     <w:lvl w:ilvl="8" w:tplc="04090005" w:tentative="1">
@@ -1467,10 +4274,19 @@
         <w:ind w:left="7200" w:hanging="360"/>
       </w:pPr>
       <w:rPr>
-        <w:rFonts w:ascii="Wingdings" w:hAnsi="Wingdings" w:hint="default"/>
+        <w:rFonts w:hint="default" w:ascii="Wingdings" w:hAnsi="Wingdings"/>
       </w:rPr>
     </w:lvl>
   </w:abstractNum>
+  <w:num w:numId="6">
+    <w:abstractNumId w:val="5"/>
+  </w:num>
+  <w:num w:numId="5">
+    <w:abstractNumId w:val="4"/>
+  </w:num>
+  <w:num w:numId="4">
+    <w:abstractNumId w:val="3"/>
+  </w:num>
   <w:num w:numId="1">
     <w:abstractNumId w:val="0"/>
   </w:num>
@@ -1484,11 +4300,11 @@
 </file>
 
 <file path=word/styles.xml><?xml version="1.0" encoding="utf-8"?>
-<w:styles xmlns:mc="http://schemas.openxmlformats.org/markup-compatibility/2006" xmlns:r="http://schemas.openxmlformats.org/officeDocument/2006/relationships" xmlns:w="http://schemas.openxmlformats.org/wordprocessingml/2006/main" xmlns:w14="http://schemas.microsoft.com/office/word/2010/wordml" xmlns:w15="http://schemas.microsoft.com/office/word/2012/wordml" xmlns:w16se="http://schemas.microsoft.com/office/word/2015/wordml/symex" mc:Ignorable="w14 w15 w16se">
+<w:styles xmlns:wp14="http://schemas.microsoft.com/office/word/2010/wordprocessingDrawing" xmlns:mc="http://schemas.openxmlformats.org/markup-compatibility/2006" xmlns:r="http://schemas.openxmlformats.org/officeDocument/2006/relationships" xmlns:w="http://schemas.openxmlformats.org/wordprocessingml/2006/main" xmlns:w14="http://schemas.microsoft.com/office/word/2010/wordml" xmlns:w15="http://schemas.microsoft.com/office/word/2012/wordml" xmlns:w16se="http://schemas.microsoft.com/office/word/2015/wordml/symex" mc:Ignorable="w14 w15 w16se wp14">
   <w:docDefaults>
     <w:rPrDefault>
       <w:rPr>
-        <w:rFonts w:asciiTheme="minorHAnsi" w:eastAsiaTheme="minorHAnsi" w:hAnsiTheme="minorHAnsi" w:cstheme="minorBidi"/>
+        <w:rFonts w:asciiTheme="minorHAnsi" w:hAnsiTheme="minorHAnsi" w:eastAsiaTheme="minorHAnsi" w:cstheme="minorBidi"/>
         <w:sz w:val="22"/>
         <w:szCs w:val="22"/>
         <w:lang w:val="en-US" w:eastAsia="en-US" w:bidi="ar-SA"/>
@@ -1503,14 +4319,14 @@
   <w:latentStyles w:defLockedState="0" w:defUIPriority="99" w:defSemiHidden="0" w:defUnhideWhenUsed="0" w:defQFormat="0" w:count="371">
     <w:lsdException w:name="Normal" w:uiPriority="0" w:qFormat="1"/>
     <w:lsdException w:name="heading 1" w:uiPriority="9" w:qFormat="1"/>
-    <w:lsdException w:name="heading 2" w:semiHidden="1" w:uiPriority="9" w:unhideWhenUsed="1" w:qFormat="1"/>
-    <w:lsdException w:name="heading 3" w:semiHidden="1" w:uiPriority="9" w:unhideWhenUsed="1" w:qFormat="1"/>
-    <w:lsdException w:name="heading 4" w:semiHidden="1" w:uiPriority="9" w:unhideWhenUsed="1" w:qFormat="1"/>
-    <w:lsdException w:name="heading 5" w:semiHidden="1" w:uiPriority="9" w:unhideWhenUsed="1" w:qFormat="1"/>
-    <w:lsdException w:name="heading 6" w:semiHidden="1" w:uiPriority="9" w:unhideWhenUsed="1" w:qFormat="1"/>
-    <w:lsdException w:name="heading 7" w:semiHidden="1" w:uiPriority="9" w:unhideWhenUsed="1" w:qFormat="1"/>
-    <w:lsdException w:name="heading 8" w:semiHidden="1" w:uiPriority="9" w:unhideWhenUsed="1" w:qFormat="1"/>
-    <w:lsdException w:name="heading 9" w:semiHidden="1" w:uiPriority="9" w:unhideWhenUsed="1" w:qFormat="1"/>
+    <w:lsdException w:name="heading 2" w:uiPriority="9" w:semiHidden="1" w:unhideWhenUsed="1" w:qFormat="1"/>
+    <w:lsdException w:name="heading 3" w:uiPriority="9" w:semiHidden="1" w:unhideWhenUsed="1" w:qFormat="1"/>
+    <w:lsdException w:name="heading 4" w:uiPriority="9" w:semiHidden="1" w:unhideWhenUsed="1" w:qFormat="1"/>
+    <w:lsdException w:name="heading 5" w:uiPriority="9" w:semiHidden="1" w:unhideWhenUsed="1" w:qFormat="1"/>
+    <w:lsdException w:name="heading 6" w:uiPriority="9" w:semiHidden="1" w:unhideWhenUsed="1" w:qFormat="1"/>
+    <w:lsdException w:name="heading 7" w:uiPriority="9" w:semiHidden="1" w:unhideWhenUsed="1" w:qFormat="1"/>
+    <w:lsdException w:name="heading 8" w:uiPriority="9" w:semiHidden="1" w:unhideWhenUsed="1" w:qFormat="1"/>
+    <w:lsdException w:name="heading 9" w:uiPriority="9" w:semiHidden="1" w:unhideWhenUsed="1" w:qFormat="1"/>
     <w:lsdException w:name="index 1" w:semiHidden="1" w:unhideWhenUsed="1"/>
     <w:lsdException w:name="index 2" w:semiHidden="1" w:unhideWhenUsed="1"/>
     <w:lsdException w:name="index 3" w:semiHidden="1" w:unhideWhenUsed="1"/>
@@ -1520,22 +4336,22 @@
     <w:lsdException w:name="index 7" w:semiHidden="1" w:unhideWhenUsed="1"/>
     <w:lsdException w:name="index 8" w:semiHidden="1" w:unhideWhenUsed="1"/>
     <w:lsdException w:name="index 9" w:semiHidden="1" w:unhideWhenUsed="1"/>
-    <w:lsdException w:name="toc 1" w:semiHidden="1" w:uiPriority="39" w:unhideWhenUsed="1"/>
-    <w:lsdException w:name="toc 2" w:semiHidden="1" w:uiPriority="39" w:unhideWhenUsed="1"/>
-    <w:lsdException w:name="toc 3" w:semiHidden="1" w:uiPriority="39" w:unhideWhenUsed="1"/>
-    <w:lsdException w:name="toc 4" w:semiHidden="1" w:uiPriority="39" w:unhideWhenUsed="1"/>
-    <w:lsdException w:name="toc 5" w:semiHidden="1" w:uiPriority="39" w:unhideWhenUsed="1"/>
-    <w:lsdException w:name="toc 6" w:semiHidden="1" w:uiPriority="39" w:unhideWhenUsed="1"/>
-    <w:lsdException w:name="toc 7" w:semiHidden="1" w:uiPriority="39" w:unhideWhenUsed="1"/>
-    <w:lsdException w:name="toc 8" w:semiHidden="1" w:uiPriority="39" w:unhideWhenUsed="1"/>
-    <w:lsdException w:name="toc 9" w:semiHidden="1" w:uiPriority="39" w:unhideWhenUsed="1"/>
+    <w:lsdException w:name="toc 1" w:uiPriority="39" w:semiHidden="1" w:unhideWhenUsed="1"/>
+    <w:lsdException w:name="toc 2" w:uiPriority="39" w:semiHidden="1" w:unhideWhenUsed="1"/>
+    <w:lsdException w:name="toc 3" w:uiPriority="39" w:semiHidden="1" w:unhideWhenUsed="1"/>
+    <w:lsdException w:name="toc 4" w:uiPriority="39" w:semiHidden="1" w:unhideWhenUsed="1"/>
+    <w:lsdException w:name="toc 5" w:uiPriority="39" w:semiHidden="1" w:unhideWhenUsed="1"/>
+    <w:lsdException w:name="toc 6" w:uiPriority="39" w:semiHidden="1" w:unhideWhenUsed="1"/>
+    <w:lsdException w:name="toc 7" w:uiPriority="39" w:semiHidden="1" w:unhideWhenUsed="1"/>
+    <w:lsdException w:name="toc 8" w:uiPriority="39" w:semiHidden="1" w:unhideWhenUsed="1"/>
+    <w:lsdException w:name="toc 9" w:uiPriority="39" w:semiHidden="1" w:unhideWhenUsed="1"/>
     <w:lsdException w:name="Normal Indent" w:semiHidden="1" w:unhideWhenUsed="1"/>
     <w:lsdException w:name="footnote text" w:semiHidden="1" w:unhideWhenUsed="1"/>
     <w:lsdException w:name="annotation text" w:semiHidden="1" w:unhideWhenUsed="1"/>
     <w:lsdException w:name="header" w:semiHidden="1" w:unhideWhenUsed="1"/>
     <w:lsdException w:name="footer" w:semiHidden="1" w:unhideWhenUsed="1"/>
     <w:lsdException w:name="index heading" w:semiHidden="1" w:unhideWhenUsed="1"/>
-    <w:lsdException w:name="caption" w:semiHidden="1" w:uiPriority="35" w:unhideWhenUsed="1" w:qFormat="1"/>
+    <w:lsdException w:name="caption" w:uiPriority="35" w:semiHidden="1" w:unhideWhenUsed="1" w:qFormat="1"/>
     <w:lsdException w:name="table of figures" w:semiHidden="1" w:unhideWhenUsed="1"/>
     <w:lsdException w:name="envelope address" w:semiHidden="1" w:unhideWhenUsed="1"/>
     <w:lsdException w:name="envelope return" w:semiHidden="1" w:unhideWhenUsed="1"/>
@@ -1566,7 +4382,7 @@
     <w:lsdException w:name="Title" w:uiPriority="10" w:qFormat="1"/>
     <w:lsdException w:name="Closing" w:semiHidden="1" w:unhideWhenUsed="1"/>
     <w:lsdException w:name="Signature" w:semiHidden="1" w:unhideWhenUsed="1"/>
-    <w:lsdException w:name="Default Paragraph Font" w:semiHidden="1" w:uiPriority="1" w:unhideWhenUsed="1"/>
+    <w:lsdException w:name="Default Paragraph Font" w:uiPriority="1" w:semiHidden="1" w:unhideWhenUsed="1"/>
     <w:lsdException w:name="Body Text" w:semiHidden="1" w:unhideWhenUsed="1"/>
     <w:lsdException w:name="Body Text Indent" w:semiHidden="1" w:unhideWhenUsed="1"/>
     <w:lsdException w:name="List Continue" w:semiHidden="1" w:unhideWhenUsed="1"/>
@@ -1766,8 +4582,8 @@
     <w:lsdException w:name="Subtle Reference" w:uiPriority="31" w:qFormat="1"/>
     <w:lsdException w:name="Intense Reference" w:uiPriority="32" w:qFormat="1"/>
     <w:lsdException w:name="Book Title" w:uiPriority="33" w:qFormat="1"/>
-    <w:lsdException w:name="Bibliography" w:semiHidden="1" w:uiPriority="37" w:unhideWhenUsed="1"/>
-    <w:lsdException w:name="TOC Heading" w:semiHidden="1" w:uiPriority="39" w:unhideWhenUsed="1" w:qFormat="1"/>
+    <w:lsdException w:name="Bibliography" w:uiPriority="37" w:semiHidden="1" w:unhideWhenUsed="1"/>
+    <w:lsdException w:name="TOC Heading" w:uiPriority="39" w:semiHidden="1" w:unhideWhenUsed="1" w:qFormat="1"/>
     <w:lsdException w:name="Plain Table 1" w:uiPriority="41"/>
     <w:lsdException w:name="Plain Table 2" w:uiPriority="42"/>
     <w:lsdException w:name="Plain Table 3" w:uiPriority="43"/>
@@ -1873,17 +4689,17 @@
     <w:lsdException w:name="List Table 6 Colorful Accent 6" w:uiPriority="51"/>
     <w:lsdException w:name="List Table 7 Colorful Accent 6" w:uiPriority="52"/>
   </w:latentStyles>
-  <w:style w:type="paragraph" w:default="1" w:styleId="Normal">
+  <w:style w:type="paragraph" w:styleId="Normal" w:default="1">
     <w:name w:val="Normal"/>
     <w:qFormat/>
   </w:style>
-  <w:style w:type="character" w:default="1" w:styleId="DefaultParagraphFont">
+  <w:style w:type="character" w:styleId="DefaultParagraphFont" w:default="1">
     <w:name w:val="Default Paragraph Font"/>
     <w:uiPriority w:val="1"/>
     <w:semiHidden/>
     <w:unhideWhenUsed/>
   </w:style>
-  <w:style w:type="table" w:default="1" w:styleId="TableNormal">
+  <w:style w:type="table" w:styleId="TableNormal" w:default="1">
     <w:name w:val="Normal Table"/>
     <w:uiPriority w:val="99"/>
     <w:semiHidden/>
@@ -1898,7 +4714,7 @@
       </w:tblCellMar>
     </w:tblPr>
   </w:style>
-  <w:style w:type="numbering" w:default="1" w:styleId="NoList">
+  <w:style w:type="numbering" w:styleId="NoList" w:default="1">
     <w:name w:val="No List"/>
     <w:uiPriority w:val="99"/>
     <w:semiHidden/>
@@ -1930,7 +4746,7 @@
 </file>
 
 <file path=word/theme/theme1.xml><?xml version="1.0" encoding="utf-8"?>
-<a:theme xmlns:a="http://schemas.openxmlformats.org/drawingml/2006/main" name="Office Theme">
+<a:theme xmlns:a="http://schemas.openxmlformats.org/drawingml/2006/main" xmlns:thm15="http://schemas.microsoft.com/office/thememl/2012/main" name="Office Theme">
   <a:themeElements>
     <a:clrScheme name="Office">
       <a:dk1>

</xml_diff>